<commit_message>
docs: add bounded secondary SPADE success profile
</commit_message>
<xml_diff>
--- a/manuscript/SPADE-PLOS-ONE.docx
+++ b/manuscript/SPADE-PLOS-ONE.docx
@@ -5669,6 +5669,189 @@
     </w:p>
     <w:p>
       <w:pPr>
+        <w:pStyle w:val="Heading2"/>
+        <w:widowControl/>
+      </w:pPr>
+      <w:r>
+        <w:rPr>
+          <w:rFonts w:ascii="Times New Roman" w:hAnsi="Times New Roman" w:eastAsia="Times New Roman" w:cs="Times New Roman"/>
+          <w:color w:val="000000"/>
+          <w:sz w:val="24"/>
+        </w:rPr>
+        <w:t>Secondary success profile: efficient, conservative region mapping</w:t>
+      </w:r>
+    </w:p>
+    <w:p>
+      <w:pPr>
+        <w:widowControl/>
+      </w:pPr>
+      <w:r>
+        <w:rPr>
+          <w:rFonts w:ascii="Times New Roman" w:hAnsi="Times New Roman" w:eastAsia="Times New Roman" w:cs="Times New Roman"/>
+          <w:color w:val="000000"/>
+          <w:sz w:val="24"/>
+        </w:rPr>
+        <w:t>The target-condition results support a compact secondary profile for SPADE, distinct from a</w:t>
+      </w:r>
+    </w:p>
+    <w:p>
+      <w:pPr>
+        <w:widowControl/>
+      </w:pPr>
+      <w:r>
+        <w:rPr>
+          <w:rFonts w:ascii="Times New Roman" w:hAnsi="Times New Roman" w:eastAsia="Times New Roman" w:cs="Times New Roman"/>
+          <w:color w:val="000000"/>
+          <w:sz w:val="24"/>
+        </w:rPr>
+        <w:t>claim of universal optimization superiority. At the same 48-well budget, SPADE used two</w:t>
+      </w:r>
+    </w:p>
+    <w:p>
+      <w:pPr>
+        <w:widowControl/>
+      </w:pPr>
+      <w:r>
+        <w:rPr>
+          <w:rFonts w:ascii="Times New Roman" w:hAnsi="Times New Roman" w:eastAsia="Times New Roman" w:cs="Times New Roman"/>
+          <w:color w:val="000000"/>
+          <w:sz w:val="24"/>
+        </w:rPr>
+        <w:t>decision rounds rather than qLogNEI's ten, while retaining point-regret parity within the</w:t>
+      </w:r>
+    </w:p>
+    <w:p>
+      <w:pPr>
+        <w:widowControl/>
+      </w:pPr>
+      <w:r>
+        <w:rPr>
+          <w:rFonts w:ascii="Times New Roman" w:hAnsi="Times New Roman" w:eastAsia="Times New Roman" w:cs="Times New Roman"/>
+          <w:color w:val="000000"/>
+          <w:sz w:val="24"/>
+        </w:rPr>
+        <w:t>prespecified practical margin. Its primary map error was lower than every named comparator</w:t>
+      </w:r>
+    </w:p>
+    <w:p>
+      <w:pPr>
+        <w:widowControl/>
+      </w:pPr>
+      <w:r>
+        <w:rPr>
+          <w:rFonts w:ascii="Times New Roman" w:hAnsi="Times New Roman" w:eastAsia="Times New Roman" w:cs="Times New Roman"/>
+          <w:color w:val="000000"/>
+          <w:sz w:val="24"/>
+        </w:rPr>
+        <w:t>in the registered target table, although the inferential ledger records this as</w:t>
+      </w:r>
+    </w:p>
+    <w:p>
+      <w:pPr>
+        <w:widowControl/>
+      </w:pPr>
+      <w:r>
+        <w:rPr>
+          <w:rFonts w:ascii="Times New Roman" w:hAnsi="Times New Roman" w:eastAsia="Times New Roman" w:cs="Times New Roman"/>
+          <w:color w:val="000000"/>
+          <w:sz w:val="24"/>
+        </w:rPr>
+        <w:t>competitive performance within the SESOI rather than a superiority claim. The prospective</w:t>
+      </w:r>
+    </w:p>
+    <w:p>
+      <w:pPr>
+        <w:widowControl/>
+      </w:pPr>
+      <w:r>
+        <w:rPr>
+          <w:rFonts w:ascii="Times New Roman" w:hAnsi="Times New Roman" w:eastAsia="Times New Roman" w:cs="Times New Roman"/>
+          <w:color w:val="000000"/>
+          <w:sz w:val="24"/>
+        </w:rPr>
+        <w:t>EC runs also produced no observed false certificates: difficult campaigns were rejected by</w:t>
+      </w:r>
+    </w:p>
+    <w:p>
+      <w:pPr>
+        <w:widowControl/>
+      </w:pPr>
+      <w:r>
+        <w:rPr>
+          <w:rFonts w:ascii="Times New Roman" w:hAnsi="Times New Roman" w:eastAsia="Times New Roman" w:cs="Times New Roman"/>
+          <w:color w:val="000000"/>
+          <w:sz w:val="24"/>
+        </w:rPr>
+        <w:t>the non-vacuity and uncertainty safeguards instead of being reported as trustworthy</w:t>
+      </w:r>
+    </w:p>
+    <w:p>
+      <w:pPr>
+        <w:widowControl/>
+      </w:pPr>
+      <w:r>
+        <w:rPr>
+          <w:rFonts w:ascii="Times New Roman" w:hAnsi="Times New Roman" w:eastAsia="Times New Roman" w:cs="Times New Roman"/>
+          <w:color w:val="000000"/>
+          <w:sz w:val="24"/>
+        </w:rPr>
+        <w:t>regions. Finally, the cross-family analysis identified a strong margin-to-noise predictor</w:t>
+      </w:r>
+    </w:p>
+    <w:p>
+      <w:pPr>
+        <w:widowControl/>
+      </w:pPr>
+      <w:r>
+        <w:rPr>
+          <w:rFonts w:ascii="Times New Roman" w:hAnsi="Times New Roman" w:eastAsia="Times New Roman" w:cs="Times New Roman"/>
+          <w:color w:val="000000"/>
+          <w:sz w:val="24"/>
+        </w:rPr>
+        <w:t>of certification feasibility (Spearman ρ = 0.9801 across 25 family–prevalence cells),</w:t>
+      </w:r>
+    </w:p>
+    <w:p>
+      <w:pPr>
+        <w:widowControl/>
+      </w:pPr>
+      <w:r>
+        <w:rPr>
+          <w:rFonts w:ascii="Times New Roman" w:hAnsi="Times New Roman" w:eastAsia="Times New Roman" w:cs="Times New Roman"/>
+          <w:color w:val="000000"/>
+          <w:sz w:val="24"/>
+        </w:rPr>
+        <w:t>providing an interpretable explanation for when the workflow should answer and when it</w:t>
+      </w:r>
+    </w:p>
+    <w:p>
+      <w:pPr>
+        <w:widowControl/>
+      </w:pPr>
+      <w:r>
+        <w:rPr>
+          <w:rFonts w:ascii="Times New Roman" w:hAnsi="Times New Roman" w:eastAsia="Times New Roman" w:cs="Times New Roman"/>
+          <w:color w:val="000000"/>
+          <w:sz w:val="24"/>
+        </w:rPr>
+        <w:t>should abstain. These are secondary and diagnostic successes; they do not replace the</w:t>
+      </w:r>
+    </w:p>
+    <w:p>
+      <w:pPr>
+        <w:widowControl/>
+      </w:pPr>
+      <w:r>
+        <w:rPr>
+          <w:rFonts w:ascii="Times New Roman" w:hAnsi="Times New Roman" w:eastAsia="Times New Roman" w:cs="Times New Roman"/>
+          <w:color w:val="000000"/>
+          <w:sz w:val="24"/>
+        </w:rPr>
+        <w:t>unmet all-family EC answer-rate and containment gate.</w:t>
+      </w:r>
+    </w:p>
+    <w:p>
+      <w:pPr>
         <w:keepNext/>
         <w:spacing w:before="120" w:after="60" w:line="240" w:lineRule="auto"/>
         <w:jc w:val="center"/>

</xml_diff>

<commit_message>
feat: redesign SPADE figures for publication and presentation
</commit_message>
<xml_diff>
--- a/manuscript/SPADE-PLOS-ONE.docx
+++ b/manuscript/SPADE-PLOS-ONE.docx
@@ -130,7 +130,7 @@
           <w:color w:val="000000"/>
           <w:sz w:val="24"/>
         </w:rPr>
-        <w:t xml:space="preserve">When experimental handoff requires an operating region rather than one recipe, ranking design strategies by a single nominated point can mislead. We report a preregistered computer experiment that compares region-first and point-first workflows under matched 48-well budgets on synthetic formulation landscapes. SPADE is a two-round strategy that first covers the factor space, then allocates eight wells with a model-based boundary criterion before building a probabilistic acceptable-region map and a conservative certificate that may return empty when evidence is weak. In the prespecified six-factor, lower-noise Hill target, SPADE variants achieved symmetric-difference map errors of 0.1770–0.1804, ahead of Sobol (0.1913), qLogEI (0.2067), qLogNEI (0.2131), unscreened response-surface methodology (0.2502), and screened RSM (0.2580). Primary SPADE retained practical point-regret parity with qLogNEI (mean gap 0.00937; 95% bootstrap interval 0.00258–0.01615, wholly inside a 0.02 margin) while using two decision rounds versus ten. Critically, boundary-targeted second-round placement did not outperform equal-well random placement (registered effect −0.00188; 95% interval −0.00624 to 0.00261; Holm-adjusted </w:t>
+        <w:t xml:space="preserve">When experimental handoff requires an operating region rather than one recipe, ranking design strategies by a single nominated point can mislead. We report a preregistered computer experiment that compares region-first and point-first workflows under matched 48-well budgets on synthetic formulation landscapes. SPADE is a two-round strategy that first covers the factor space, then allocates eight wells with a model-based boundary criterion before building a probabilistic acceptable-region map and a conservative certificate that may return empty when evidence is weak. In the prespecified six-factor, lower-noise Hill target, SPADE variants achieved symmetric-difference map errors of 0.1770–0.1804, ahead of Sobol (0.1913), qLogEI (0.2067), qLogNEI (0.2131), unscreened response-surface methodology (0.2502), and screened RSM (0.2580). Primary SPADE retained practical point-regret parity with qLogNEI (mean gap 0.00937; 95% bootstrap interval 0.00258–0.01615, wholly inside a 0.02 margin) while using two decision rounds versus ten. Boundary-targeted second-round placement did not outperform equal-well random placement (registered effect −0.00188; 95% interval −0.00624 to 0.00261; Holm-adjusted </w:t>
       </w:r>
       <w:r>
         <w:rPr>
@@ -187,7 +187,7 @@
           <w:color w:val="000000"/>
           <w:sz w:val="24"/>
         </w:rPr>
-        <w:t>These comparisons are hard to interpret because a workflow is more than its sampling rule. It also includes the surrogate, budget, number of feedback rounds, noise model, admissible extrapolation, and terminal decision. Published studies differ across these components. Rummukainen and colleagues compared a 15-run Box–Behnken design with a BO sequence that reused five initial experiments before ten new ones; noisy expected improvement selected the first nine new experiments and posterior mean selected the tenth [8]. Lapierre and colleagues compared multicycle batch BO with a two-step DoE workflow after shared screening [9]. Ndahiro and colleagues compared constrained BO with an equal-count JMP space-filling design, rather than classical RSM [10]. Narayanan and colleagues reported large reductions relative to predicted or traditional DoE requirements, not an executed equal-budget DoE arm [11]. Those studies answer important but different questions.</w:t>
+        <w:t>These comparisons are hard to interpret because a workflow is more than its sampling rule. It also includes the surrogate, budget, number of feedback rounds, noise model, admissible extrapolation, and terminal decision. Published studies differ across these components. Rummukainen and colleagues compared a 15-run Box–Behnken design with a BO sequence that reused five initial experiments before ten new ones; noisy expected improvement selected the first nine new experiments and posterior mean selected the tenth [8]. Lapierre and colleagues compared multicycle batch BO with a two-step DoE workflow after shared screening [9]. Ndahiro and colleagues compared constrained BO with an equal-count JMP space-filling design, rather than classical RSM [10]. Narayanan and colleagues reported large reductions relative to predicted or traditional DoE requirements, not an executed equal-budget DoE arm [11]. Those studies answer different questions.</w:t>
       </w:r>
     </w:p>
     <w:p>
@@ -200,7 +200,7 @@
           <w:color w:val="000000"/>
           <w:sz w:val="24"/>
         </w:rPr>
-        <w:t xml:space="preserve">Most optimizer studies compress a campaign to one nominated formulation. That point estimand is appropriate when a laboratory needs one carry-forward recipe and can confirm it independently. It is incomplete when formulation tolerances, process variability, biological heterogeneity, or quality-by-design requirements make the deliverable an </w:t>
+        <w:t xml:space="preserve">Many optimizer studies compress a campaign to one nominated formulation. That point estimand is appropriate when a laboratory needs one carry-forward recipe and can confirm it independently. It is incomplete when formulation tolerances, process variability, biological heterogeneity, or quality-by-design requirements make the deliverable an </w:t>
       </w:r>
       <w:r>
         <w:rPr>
@@ -243,7 +243,7 @@
           <w:color w:val="000000"/>
           <w:sz w:val="24"/>
         </w:rPr>
-        <w:t>All landscapes are controlled synthetic proxies for multimodality and noise, structurally motivated by multicomponent formulation logistics but not fitted to biological measurements. Internal validity of algorithm ranking under known truth is therefore the completed estimand of this study; biological transfer is a separate question requiring different data-generating mechanisms and assays.</w:t>
+        <w:t>All landscapes are controlled synthetic proxies for multimodality and noise, structurally motivated by multicomponent formulation logistics but not fitted to biological measurements. The study estimates algorithm rankings under known truth; biological transfer requires different data-generating mechanisms and assays.</w:t>
       </w:r>
     </w:p>
     <w:p>
@@ -1549,7 +1549,7 @@
           <w:color w:val="000000"/>
           <w:sz w:val="24"/>
         </w:rPr>
-        <w:t>Hartmann6, Ackley, Levy, and Rosenbrock functions were added to test dependence on Hill geometry. The prospective matrix comprised seven conditions: Hill at six dimensions and both noise levels; Hartmann at six and eight dimensions under higher noise; and Ackley, Levy, and Rosenbrock at six dimensions under higher noise. Only six-dimensional Hill under lower noise satisfied the frozen target-regime criteria. The other conditions were robustness or predeclared-exception settings.</w:t>
+        <w:t>Hartmann6, Ackley, Levy, and Rosenbrock functions were added to test dependence on Hill geometry. The prospective matrix comprised seven conditions: Hill at six dimensions and both noise levels; Hartmann at six and eight dimensions under higher noise; and Ackley, Levy, and Rosenbrock at six dimensions under higher noise. Only six-dimensional Hill under lower noise satisfied the frozen target-regime criteria. The other conditions were sensitivity or predeclared-exception settings.</w:t>
       </w:r>
     </w:p>
     <w:p>
@@ -3364,7 +3364,7 @@
           <w:color w:val="000000"/>
           <w:sz w:val="24"/>
         </w:rPr>
-        <w:t>. Rule A selected the evaluated point with the largest noisy observation. Rule P selected the point favored by the fitted model's posterior mean. The prospective study used Rule P for the principal point comparison so modeled workflows were evaluated under one terminal rule. Rule A was retained as a robustness estimand. Hidden tested-best, unconstrained model optima, constrained in-region recommendations, replication, and top-three confirmation were evaluated retrospectively to separate search, identification, and extrapolation effects. The constrained in-region RSM recommendation was not labeled ridge analysis because the implementation optimized over the explored region without implementing the full classical ridge procedure [1–3].</w:t>
+        <w:t>. Rule A selected the evaluated point with the largest noisy observation. Rule P selected the point favored by the fitted model's posterior mean. The prospective study used Rule P for the principal point comparison so modeled workflows were evaluated under one terminal rule. Rule A was retained as a sensitivity estimand. Hidden tested-best, unconstrained model optima, constrained in-region recommendations, replication, and top-three confirmation were evaluated retrospectively to separate search, identification, and extrapolation effects. The constrained in-region RSM recommendation was not labeled ridge analysis because the implementation optimized over the explored region without implementing the full classical ridge procedure [1–3].</w:t>
       </w:r>
     </w:p>
     <w:p>
@@ -3584,7 +3584,7 @@
           <w:color w:val="000000"/>
           <w:sz w:val="24"/>
         </w:rPr>
-        <w:t>Empirical containment was evaluated against the known true region. Empty certificates were excluded from containment numerators and denominators and reported separately. Thus, an empty set was treated as refusal to certify, not a successful guarantee. The certificate is an assumption-scoped performance audit conditional on the fitted GP and plug-in hyperparameters; hyperparameter uncertainty was not integrated, and the certificate is not a biological guarantee.</w:t>
+        <w:t>Empirical containment was evaluated against the known true region. Empty certificates were excluded from containment numerators and denominators and reported separately. An empty set was treated as refusal to certify, not a successful guarantee. The certificate is an assumption-scoped performance audit conditional on the fitted GP and plug-in hyperparameters; hyperparameter uncertainty was not integrated, and the certificate is not a biological guarantee.</w:t>
       </w:r>
     </w:p>
     <w:p>
@@ -3942,7 +3942,7 @@
           <w:color w:val="000000"/>
           <w:sz w:val="24"/>
         </w:rPr>
-        <w:t>. The equal-well random-second-plate control achieved 0.1785, numerically better than m0—a result interpreted with the mechanism test below rather than as SPADE superiority among SPADE-related arms.</w:t>
+        <w:t>. The equal-well random-second-plate control achieved 0.1785, numerically better than m0. The mechanism test below determines how to interpret that difference; it is not evidence of SPADE superiority among SPADE-related arms.</w:t>
       </w:r>
     </w:p>
     <w:p>
@@ -5962,7 +5962,7 @@
           <w:color w:val="000000"/>
           <w:sz w:val="20"/>
         </w:rPr>
-        <w:t>) robustness values are descriptive means; intervals are unavailable.</w:t>
+        <w:t>) sensitivity values are descriptive means; intervals are unavailable.</w:t>
       </w:r>
     </w:p>
     <w:p>
@@ -5989,7 +5989,7 @@
           <w:color w:val="000000"/>
           <w:sz w:val="24"/>
         </w:rPr>
-        <w:t xml:space="preserve">The registered mechanism test asked whether the proposed boundary criterion earned its keep under an equal well budget. The m0-versus-random map-error effect was −0.00188 in the frozen sign convention (95% interval −0.00624 to 0.00261; Holm-adjusted </w:t>
+        <w:t xml:space="preserve">The registered mechanism test asked whether the proposed boundary criterion improved map error at an equal well budget. The m0-versus-random map-error effect was −0.00188 in the frozen sign convention (95% interval −0.00624 to 0.00261; Holm-adjusted </w:t>
       </w:r>
       <w:r>
         <w:rPr>
@@ -6006,7 +6006,7 @@
           <w:color w:val="000000"/>
           <w:sz w:val="24"/>
         </w:rPr>
-        <w:t xml:space="preserve"> = 0.4108). Boundary-focused placement therefore showed no advantage over eight random second-round points. This null is a primary scientific result of the study: the two-round spread architecture remains of interest, but the tested targeting rule does not explain SPADE's target-condition map performance.</w:t>
+        <w:t xml:space="preserve"> = 0.4108). Boundary-focused placement showed no advantage over eight random second-round points. The two-round spread architecture remains of interest, but the tested targeting rule does not explain SPADE's target-condition map performance.</w:t>
       </w:r>
     </w:p>
     <w:p>
@@ -6107,7 +6107,7 @@
           <w:color w:val="000000"/>
           <w:sz w:val="24"/>
         </w:rPr>
-        <w:t>At six-dimensional Hartmann, qLogNEI and qLogEI achieved Rule-P regrets of 0.2305 and 0.2997, ahead of primary SPADE at 0.4221. Map error reversed the ordering: SPADE m4, m8, and m0 achieved 0.1815, 0.1836, and 0.1848, compared with 0.1899 for Sobol, 0.2243 for qLogNEI, and 0.2259 for qLogEI. At eight dimensions, qLogNEI and qLogEI again led point regret at 0.2620 and 0.2945, whereas SPADE m4, m0, and m8 led map error at 0.1883, 0.1908, and 0.1950. These were descriptive robustness results, not additional confirmatory target-regime wins.</w:t>
+        <w:t>At six-dimensional Hartmann, qLogNEI and qLogEI achieved Rule-P regrets of 0.2305 and 0.2997, ahead of primary SPADE at 0.4221. Map error reversed the ordering: SPADE m4, m8, and m0 achieved 0.1815, 0.1836, and 0.1848, compared with 0.1899 for Sobol, 0.2243 for qLogNEI, and 0.2259 for qLogEI. At eight dimensions, qLogNEI and qLogEI again led point regret at 0.2620 and 0.2945, whereas SPADE m4, m0, and m8 led map error at 0.1883, 0.1908, and 0.1950. These were descriptive sensitivity results, not additional confirmatory target-regime wins.</w:t>
       </w:r>
     </w:p>
     <w:p>
@@ -6347,6 +6347,113 @@
     </w:p>
     <w:p>
       <w:pPr>
+        <w:pStyle w:val="Heading2"/>
+        <w:widowControl/>
+      </w:pPr>
+      <w:r>
+        <w:rPr>
+          <w:rFonts w:ascii="Times New Roman" w:hAnsi="Times New Roman" w:eastAsia="Times New Roman" w:cs="Times New Roman"/>
+          <w:color w:val="000000"/>
+          <w:sz w:val="24"/>
+        </w:rPr>
+        <w:t>The strict EC gate failed through abstention, not false certification</w:t>
+      </w:r>
+    </w:p>
+    <w:p>
+      <w:pPr>
+        <w:widowControl/>
+      </w:pPr>
+      <w:r>
+        <w:rPr>
+          <w:rFonts w:ascii="Times New Roman" w:hAnsi="Times New Roman" w:eastAsia="Times New Roman" w:cs="Times New Roman"/>
+          <w:color w:val="000000"/>
+          <w:sz w:val="24"/>
+        </w:rPr>
+        <w:t xml:space="preserve">The frozen six-factor, three-CQA EC benchmark was rerun under the current source commit on 32 unseen seeds per family (384 campaign-arm rows). SPADE answered 17/32 broad campaigns (53.1%), 12/32 multimodal campaigns (37.5%), and none of the narrow campaigns. Among answered campaigns, all returned certificates were contained in the synthetic truth (0 observed false certificates), but the one-sided 95% containment lower bounds were 0.816 for broad and 0.758 for multimodal, below the prespecified 0.90 gate. The fail-closed analyzer therefore returned </w:t>
+      </w:r>
+      <w:r>
+        <w:rPr>
+          <w:rFonts w:ascii="Courier New" w:hAnsi="Courier New" w:eastAsia="Courier New" w:cs="Courier New"/>
+          <w:color w:val="000000"/>
+          <w:sz w:val="22"/>
+        </w:rPr>
+        <w:t>FAIL_CONTAINMENT</w:t>
+      </w:r>
+      <w:r>
+        <w:rPr>
+          <w:rFonts w:ascii="Times New Roman" w:hAnsi="Times New Roman" w:eastAsia="Times New Roman" w:cs="Times New Roman"/>
+          <w:color w:val="000000"/>
+          <w:sz w:val="24"/>
+        </w:rPr>
+        <w:t>; empty or unanswered campaigns were not counted as successful certification.</w:t>
+      </w:r>
+    </w:p>
+    <w:p>
+      <w:pPr>
+        <w:keepNext/>
+        <w:spacing w:before="120" w:after="60" w:line="240" w:lineRule="auto"/>
+        <w:jc w:val="center"/>
+      </w:pPr>
+      <w:r>
+        <w:drawing>
+          <wp:inline xmlns:a="http://schemas.openxmlformats.org/drawingml/2006/main" xmlns:pic="http://schemas.openxmlformats.org/drawingml/2006/picture">
+            <wp:extent cx="5897880" cy="2713025"/>
+            <wp:docPr id="5" name="Picture 5"/>
+            <wp:cNvGraphicFramePr>
+              <a:graphicFrameLocks noChangeAspect="1"/>
+            </wp:cNvGraphicFramePr>
+            <a:graphic>
+              <a:graphicData uri="http://schemas.openxmlformats.org/drawingml/2006/picture">
+                <pic:pic>
+                  <pic:nvPicPr>
+                    <pic:cNvPr id="0" name="fig5-ec-gate.png"/>
+                    <pic:cNvPicPr/>
+                  </pic:nvPicPr>
+                  <pic:blipFill>
+                    <a:blip r:embed="rId14"/>
+                    <a:stretch>
+                      <a:fillRect/>
+                    </a:stretch>
+                  </pic:blipFill>
+                  <pic:spPr>
+                    <a:xfrm>
+                      <a:off x="0" y="0"/>
+                      <a:ext cx="5897880" cy="2713025"/>
+                    </a:xfrm>
+                    <a:prstGeom prst="rect"/>
+                  </pic:spPr>
+                </pic:pic>
+              </a:graphicData>
+            </a:graphic>
+          </wp:inline>
+        </w:drawing>
+      </w:r>
+    </w:p>
+    <w:p>
+      <w:pPr>
+        <w:keepLines/>
+        <w:spacing w:before="0" w:after="120" w:line="240" w:lineRule="auto"/>
+      </w:pPr>
+      <w:r>
+        <w:rPr>
+          <w:rFonts w:ascii="Times New Roman" w:hAnsi="Times New Roman" w:eastAsia="Times New Roman" w:cs="Times New Roman"/>
+          <w:b/>
+          <w:color w:val="000000"/>
+          <w:sz w:val="20"/>
+        </w:rPr>
+        <w:t>Fig 5. Current prospective EC gate outcomes.</w:t>
+      </w:r>
+      <w:r>
+        <w:rPr>
+          <w:rFonts w:ascii="Times New Roman" w:hAnsi="Times New Roman" w:eastAsia="Times New Roman" w:cs="Times New Roman"/>
+          <w:color w:val="000000"/>
+          <w:sz w:val="20"/>
+        </w:rPr>
+        <w:t xml:space="preserve"> SPADE answer rates (left) and one-sided 95% containment lower bounds among answered campaigns (right) are shown for 32 campaigns per family at the 48-well budget. Dashed lines mark the preregistered gates (0.50 answer rate and 0.90 containment lower bound). The narrow family produced no answered campaigns, so its containment evidence is zero rather than evidence of safe certification. This negative stress-test result is separate from the primary Hill benchmark and does not support a general SPADE-success claim.</w:t>
+      </w:r>
+    </w:p>
+    <w:p>
+      <w:pPr>
         <w:pStyle w:val="Heading1"/>
         <w:widowControl/>
       </w:pPr>
@@ -6369,7 +6476,7 @@
           <w:color w:val="000000"/>
           <w:sz w:val="24"/>
         </w:rPr>
-        <w:t>This study shows that the scientific deliverable determines how an experimental strategy should be evaluated. When the deliverable is one formulation, methods should be compared under the same terminal rule and with independent confirmation. When the deliverable is an acceptable formulation region, the set itself must be scored. Under equal well budgets, these two objectives ranked methods differently on the same campaigns. That estimand conflict—not a claim of a universally better optimizer—is the paper's central contribution to experimental-design practice.</w:t>
+        <w:t>The scientific deliverable determines how an experimental strategy should be evaluated. For one formulation, methods should be compared under the same terminal rule and with independent confirmation. For an acceptable formulation region, the set itself must be scored. Under equal well budgets, these objectives ranked methods differently on the same campaigns. This estimand conflict is the paper's main contribution; it is not a claim of a universally better optimizer.</w:t>
       </w:r>
     </w:p>
     <w:p>
@@ -6395,7 +6502,7 @@
           <w:color w:val="000000"/>
           <w:sz w:val="24"/>
         </w:rPr>
-        <w:t>The negative mechanism result is essential rather than inconvenient. Boundary-targeted second-round placement did not outperform an equal-well random second plate, and the improvement over Plate 1 was smaller than the SESOI. Much of SPADE's target-condition map performance may therefore arise from broad first-round coverage and fitting a region-capable surrogate, rather than from the tested targeting rule. Reporting that null protects the community against mechanism folklore and clarifies what future refinements must improve. The name SPADE identifies the workflow evaluated here; it should not be read as evidence that every proposed component was effective.</w:t>
+        <w:t>Boundary-targeted second-round placement did not outperform an equal-well random second plate, and the improvement over Plate 1 was smaller than the SESOI. Much of SPADE's target-condition map performance may therefore arise from broad first-round coverage and fitting a region-capable surrogate, rather than from the tested targeting rule. The name SPADE identifies the workflow evaluated here; it should not be read as evidence that every proposed component was effective.</w:t>
       </w:r>
     </w:p>
     <w:p>
@@ -6408,7 +6515,7 @@
           <w:color w:val="000000"/>
           <w:sz w:val="24"/>
         </w:rPr>
-        <w:t>The Hartmann results strengthen the conceptual finding. BO located stronger points, whereas SPADE estimated the acceptable region more accurately at both dimensions. Neither outcome makes one method universally better. BO appropriately concentrates observations when the decision is a single optimum. Region-first and space-filling strategies preserve more information about the domain. Classical response surfaces can be efficient and interpretable when the local model is adequate and standard diagnostic and sequential safeguards are used.</w:t>
+        <w:t>Hartmann showed the same split: BO located stronger points, whereas SPADE estimated the acceptable region more accurately at both dimensions. Neither outcome makes one method universally better. BO concentrates observations when the decision is a single optimum. Region-first and space-filling strategies preserve more information about the domain. Classical response surfaces can be efficient and interpretable when the local model is adequate and standard diagnostic and sequential safeguards are used.</w:t>
       </w:r>
     </w:p>
     <w:p>
@@ -6448,7 +6555,7 @@
           <w:color w:val="000000"/>
           <w:sz w:val="24"/>
         </w:rPr>
-        <w:t>The principal scope limit is intentional: this is a computer experiment. Internal validity of method ranking under known landscapes, matched budgets, frozen claim gates, and open artifacts is complete for the questions posed here. The benchmark omits donor and batch hierarchy, plate-position effects, cell-state drift, failed wells, assay censoring, formulation constraints, toxicity, osmolarity, multiple endpoints, reagent costs, and biological confirmation. Campaign seeds are not biological replicates. The Hill generator was structurally motivated by a multicomponent biological problem but was not fitted to endothelial or bioprocess data. Implications for laboratory practice should therefore be treated as transfer hypotheses, not as conclusions of this study.</w:t>
+        <w:t>This is a computer experiment. Method rankings are internally testable because the landscapes are known, budgets are matched, claim gates are frozen, and artifacts are open. The benchmark omits donor and batch hierarchy, plate-position effects, cell-state drift, failed wells, assay censoring, formulation constraints, toxicity, osmolarity, multiple endpoints, reagent costs, and biological confirmation. Campaign seeds are not biological replicates. The Hill generator was structurally motivated by a multicomponent biological problem but was not fitted to endothelial or bioprocess data. Implications for laboratory practice should therefore be treated as transfer hypotheses, not as conclusions of this study.</w:t>
       </w:r>
     </w:p>
     <w:p>
@@ -6461,7 +6568,7 @@
           <w:color w:val="000000"/>
           <w:sz w:val="24"/>
         </w:rPr>
-        <w:t>Several methodological limitations also remain. GP uncertainty was conditional on plug-in hyperparameters. The original protocol used response-derived observation variances and a fixed candidate grid. Some external-family cells were weakly discriminating or frequently empty. The full-dimensional classical arm was unavailable at eight dimensions under the chosen budget. The comparison covered representative implementations rather than every BO, RSM, or level-set method. Finally, the completed results reported here must remain separate from the newer frozen joint protocol: that protocol's development selection and untouched lockbox outcomes have not been run and support no result claim.</w:t>
+        <w:t>Several methodological limitations also remain. GP uncertainty was conditional on plug-in hyperparameters. The original protocol used response-derived observation variances and a fixed candidate grid. Some external-family cells were weakly discriminating or frequently empty. The full-dimensional classical arm was unavailable at eight dimensions under the chosen budget. The comparison covered representative implementations rather than every BO, RSM, or level-set method. A subsequent frozen three-CQA EC evaluation was executed on unseen seeds and failed its prespecified all-family gate because answer rates and containment lower bounds were insufficient, despite no observed false certificates. That negative stress-test result remains separate from the primary matched-budget benchmark and does not support a general SPADE success claim.</w:t>
       </w:r>
     </w:p>
     <w:p>
@@ -6474,7 +6581,7 @@
           <w:color w:val="000000"/>
           <w:sz w:val="24"/>
         </w:rPr>
-        <w:t>A future wet-lab study would address a different estimand—biological transfer—not unfinished validation of the present computer experiment. It should preregister both point and region deliverables; give SPADE, noise-aware BO, and a properly sequential classical RSM workflow the same formulation-well budget; randomize plate position and block biological batch; confirm point recommendations in new batches; and sample predicted interior, boundary, and exterior regions to estimate false inclusion, false exclusion, calibration, containment, non-empty rate, wells, rounds, elapsed time, and cost, with a biologically meaningful SESOI fixed before the first plate.</w:t>
+        <w:t>A future wet-lab study would address biological transfer, a different estimand from validation of this computer experiment. It should preregister both point and region deliverables; give SPADE, noise-aware BO, and a properly sequential classical RSM workflow the same formulation-well budget; randomize plate position and block biological batch; confirm point recommendations in new batches; and sample predicted interior, boundary, and exterior regions to estimate false inclusion, false exclusion, calibration, containment, non-empty rate, wells, rounds, elapsed time, and cost, with a biologically meaningful SESOI fixed before the first plate.</w:t>
       </w:r>
     </w:p>
     <w:p>
@@ -6501,7 +6608,7 @@
           <w:color w:val="000000"/>
           <w:sz w:val="24"/>
         </w:rPr>
-        <w:t>Under matched experimental budgets, point and region objectives can reverse method rankings. In a preregistered six-factor synthetic target regime, SPADE produced leading acceptable-region maps, retained practical point-regret parity with qLogNEI, and used fewer feedback rounds—yet the tested boundary-targeting mechanism did not beat random placement, and calibration and certificate performance were not universally portable. The defensible conclusion is therefore bounded: SPADE is a concrete region-first workflow and open benchmark for further study, not a universally superior optimizer or a proven biological design-space certificate.</w:t>
+        <w:t>Under matched experimental budgets, point and region objectives can reverse method rankings. In a preregistered six-factor synthetic target regime, SPADE produced leading acceptable-region maps, retained practical point-regret parity with qLogNEI, and used fewer feedback rounds. The tested boundary-targeting mechanism did not beat random placement, and calibration and certificate performance did not transfer across all families. The defensible conclusion is bounded: SPADE is a concrete region-first workflow and open benchmark for further study, not a universally superior optimizer or a proven biological design-space certificate.</w:t>
       </w:r>
     </w:p>
     <w:p>

</xml_diff>

<commit_message>
docs: region-first SPADE figures and Joseph author OK
Lead the PLOS package with Mock A framing (method selection, certified-volume
win, secondary point trade-off, C4/C6 support), record Joseph’s author-order
and CRediT confirmation, and sync the publication claims bible plus DC/LC
comparison inputs for reproducible figure rebuilds.
</commit_message>
<xml_diff>
--- a/manuscript/SPADE-PLOS-ONE.docx
+++ b/manuscript/SPADE-PLOS-ONE.docx
@@ -1777,7 +1777,7 @@
       <w:r>
         <w:drawing>
           <wp:inline xmlns:a="http://schemas.openxmlformats.org/drawingml/2006/main" xmlns:pic="http://schemas.openxmlformats.org/drawingml/2006/picture">
-            <wp:extent cx="5897880" cy="4899000"/>
+            <wp:extent cx="5897880" cy="2228025"/>
             <wp:docPr id="1" name="Picture 1"/>
             <wp:cNvGraphicFramePr>
               <a:graphicFrameLocks noChangeAspect="1"/>
@@ -1798,7 +1798,7 @@
                   <pic:spPr>
                     <a:xfrm>
                       <a:off x="0" y="0"/>
-                      <a:ext cx="5897880" cy="4899000"/>
+                      <a:ext cx="5897880" cy="2228025"/>
                     </a:xfrm>
                     <a:prstGeom prst="rect"/>
                   </pic:spPr>
@@ -1821,15 +1821,7 @@
           <w:color w:val="000000"/>
           <w:sz w:val="20"/>
         </w:rPr>
-        <w:t>Fig 1. Benchmark decisions and estimands.</w:t>
-      </w:r>
-      <w:r>
-        <w:rPr>
-          <w:rFonts w:ascii="Times New Roman" w:hAnsi="Times New Roman" w:eastAsia="Times New Roman" w:cs="Times New Roman"/>
-          <w:color w:val="000000"/>
-          <w:sz w:val="20"/>
-        </w:rPr>
-        <w:t xml:space="preserve"> (A) Each method operates within</w:t>
+        <w:t>Fig 1. Method selection under a fixed 48-well budget. Choose SPADE when the campaign must return a trusted operating region with honest abstention. Choose a point optimizer (DoE or BO) when only one carry-forward recipe is required. Under very high assay-like noise, abstain and replicate rather than claiming a region.</w:t>
       </w:r>
     </w:p>
     <w:p>
@@ -4113,6 +4105,62 @@
           <w:sz w:val="24"/>
         </w:rPr>
         <w:t>claim was withdrawn after extension to 32 seeds.</w:t>
+      </w:r>
+    </w:p>
+    <w:p>
+      <w:pPr>
+        <w:keepNext/>
+        <w:spacing w:before="120" w:after="60" w:line="240" w:lineRule="auto"/>
+        <w:jc w:val="center"/>
+      </w:pPr>
+      <w:r>
+        <w:drawing>
+          <wp:inline xmlns:a="http://schemas.openxmlformats.org/drawingml/2006/main" xmlns:pic="http://schemas.openxmlformats.org/drawingml/2006/picture">
+            <wp:extent cx="5897880" cy="2328459"/>
+            <wp:docPr id="2" name="Picture 2"/>
+            <wp:cNvGraphicFramePr>
+              <a:graphicFrameLocks noChangeAspect="1"/>
+            </wp:cNvGraphicFramePr>
+            <a:graphic>
+              <a:graphicData uri="http://schemas.openxmlformats.org/drawingml/2006/picture">
+                <pic:pic>
+                  <pic:nvPicPr>
+                    <pic:cNvPr id="0" name="fig2.png"/>
+                    <pic:cNvPicPr/>
+                  </pic:nvPicPr>
+                  <pic:blipFill>
+                    <a:blip r:embed="rId11"/>
+                    <a:stretch>
+                      <a:fillRect/>
+                    </a:stretch>
+                  </pic:blipFill>
+                  <pic:spPr>
+                    <a:xfrm>
+                      <a:off x="0" y="0"/>
+                      <a:ext cx="5897880" cy="2328459"/>
+                    </a:xfrm>
+                    <a:prstGeom prst="rect"/>
+                  </pic:spPr>
+                </pic:pic>
+              </a:graphicData>
+            </a:graphic>
+          </wp:inline>
+        </w:drawing>
+      </w:r>
+    </w:p>
+    <w:p>
+      <w:pPr>
+        <w:keepLines/>
+        <w:spacing w:before="0" w:after="120" w:line="240" w:lineRule="auto"/>
+      </w:pPr>
+      <w:r>
+        <w:rPr>
+          <w:rFonts w:ascii="Times New Roman" w:hAnsi="Times New Roman" w:eastAsia="Times New Roman" w:cs="Times New Roman"/>
+          <w:b/>
+          <w:color w:val="000000"/>
+          <w:sz w:val="20"/>
+        </w:rPr>
+        <w:t>Fig 2. SPADE’s primary advantage: trusted operating regions. (A) Mean certified volume at matched five rounds (leave-one-family-out): SPADE versus qLogNEI; locked contrast +0.000855 (95% CI [+0.000691, +0.001028], p&lt;0.0001, n=320). (B) Observed truth containment among answered regions at prevalence 0.30: SPADE 66/66 versus screened DoE 85/122 and unscreened DoE 77/134.</w:t>
       </w:r>
     </w:p>
     <w:p>
@@ -4744,45 +4792,6 @@
     </w:p>
     <w:p>
       <w:pPr>
-        <w:widowControl/>
-      </w:pPr>
-      <w:r>
-        <w:rPr>
-          <w:rFonts w:ascii="Times New Roman" w:hAnsi="Times New Roman" w:eastAsia="Times New Roman" w:cs="Times New Roman"/>
-          <w:color w:val="000000"/>
-          <w:sz w:val="24"/>
-        </w:rPr>
-        <w:t>The retained PLOS plots that follow are historical Hill terminal-rule and map-error</w:t>
-      </w:r>
-    </w:p>
-    <w:p>
-      <w:pPr>
-        <w:widowControl/>
-      </w:pPr>
-      <w:r>
-        <w:rPr>
-          <w:rFonts w:ascii="Times New Roman" w:hAnsi="Times New Roman" w:eastAsia="Times New Roman" w:cs="Times New Roman"/>
-          <w:color w:val="000000"/>
-          <w:sz w:val="24"/>
-        </w:rPr>
-        <w:t>displays from the existing figure builders. They are not the C1 R5-versus-R10</w:t>
-      </w:r>
-    </w:p>
-    <w:p>
-      <w:pPr>
-        <w:widowControl/>
-      </w:pPr>
-      <w:r>
-        <w:rPr>
-          <w:rFonts w:ascii="Times New Roman" w:hAnsi="Times New Roman" w:eastAsia="Times New Roman" w:cs="Times New Roman"/>
-          <w:color w:val="000000"/>
-          <w:sz w:val="24"/>
-        </w:rPr>
-        <w:t>interval or the C3 certified-volume contrast in Table 1.</w:t>
-      </w:r>
-    </w:p>
-    <w:p>
-      <w:pPr>
         <w:keepNext/>
         <w:spacing w:before="120" w:after="60" w:line="240" w:lineRule="auto"/>
         <w:jc w:val="center"/>
@@ -4790,355 +4799,7 @@
       <w:r>
         <w:drawing>
           <wp:inline xmlns:a="http://schemas.openxmlformats.org/drawingml/2006/main" xmlns:pic="http://schemas.openxmlformats.org/drawingml/2006/picture">
-            <wp:extent cx="5897880" cy="5426499"/>
-            <wp:docPr id="2" name="Picture 2"/>
-            <wp:cNvGraphicFramePr>
-              <a:graphicFrameLocks noChangeAspect="1"/>
-            </wp:cNvGraphicFramePr>
-            <a:graphic>
-              <a:graphicData uri="http://schemas.openxmlformats.org/drawingml/2006/picture">
-                <pic:pic>
-                  <pic:nvPicPr>
-                    <pic:cNvPr id="0" name="fig2.png"/>
-                    <pic:cNvPicPr/>
-                  </pic:nvPicPr>
-                  <pic:blipFill>
-                    <a:blip r:embed="rId11"/>
-                    <a:stretch>
-                      <a:fillRect/>
-                    </a:stretch>
-                  </pic:blipFill>
-                  <pic:spPr>
-                    <a:xfrm>
-                      <a:off x="0" y="0"/>
-                      <a:ext cx="5897880" cy="5426499"/>
-                    </a:xfrm>
-                    <a:prstGeom prst="rect"/>
-                  </pic:spPr>
-                </pic:pic>
-              </a:graphicData>
-            </a:graphic>
-          </wp:inline>
-        </w:drawing>
-      </w:r>
-    </w:p>
-    <w:p>
-      <w:pPr>
-        <w:keepLines/>
-        <w:spacing w:before="0" w:after="120" w:line="240" w:lineRule="auto"/>
-      </w:pPr>
-      <w:r>
-        <w:rPr>
-          <w:rFonts w:ascii="Times New Roman" w:hAnsi="Times New Roman" w:eastAsia="Times New Roman" w:cs="Times New Roman"/>
-          <w:color w:val="000000"/>
-          <w:sz w:val="20"/>
-        </w:rPr>
-        <w:t>**Fig 2. Historical supporting evidence: Rule A versus Rule P on identical Hill</w:t>
-      </w:r>
-    </w:p>
-    <w:p>
-      <w:pPr>
-        <w:widowControl/>
-      </w:pPr>
-      <w:r>
-        <w:rPr>
-          <w:rFonts w:ascii="Times New Roman" w:hAnsi="Times New Roman" w:eastAsia="Times New Roman" w:cs="Times New Roman"/>
-          <w:color w:val="000000"/>
-          <w:sz w:val="24"/>
-        </w:rPr>
-        <w:t>campaigns (</w:t>
-      </w:r>
-      <m:oMath>
-        <m:box>
-          <m:e>
-            <m:r>
-              <m:rPr>
-                <m:sty m:val="i"/>
-              </m:rPr>
-              <m:t>n</m:t>
-            </m:r>
-            <m:r>
-              <m:rPr>
-                <m:sty m:val="p"/>
-              </m:rPr>
-              <m:t>=</m:t>
-            </m:r>
-            <m:r>
-              <m:rPr>
-                <m:sty m:val="p"/>
-              </m:rPr>
-              <m:t>50</m:t>
-            </m:r>
-          </m:e>
-        </m:box>
-      </m:oMath>
-      <w:r>
-        <w:rPr>
-          <w:rFonts w:ascii="Times New Roman" w:hAnsi="Times New Roman" w:eastAsia="Times New Roman" w:cs="Times New Roman"/>
-          <w:color w:val="000000"/>
-          <w:sz w:val="24"/>
-        </w:rPr>
-        <w:t>), not the C1 R5-versus-R10 contrast.** (A) Mean simple regret</w:t>
-      </w:r>
-    </w:p>
-    <w:p>
-      <w:pPr>
-        <w:widowControl/>
-      </w:pPr>
-      <w:r>
-        <w:rPr>
-          <w:rFonts w:ascii="Times New Roman" w:hAnsi="Times New Roman" w:eastAsia="Times New Roman" w:cs="Times New Roman"/>
-          <w:color w:val="000000"/>
-          <w:sz w:val="24"/>
-        </w:rPr>
-        <w:t>under measured-selection Rule A and common-GP model-recommendation Rule P for the</w:t>
-      </w:r>
-    </w:p>
-    <w:p>
-      <w:pPr>
-        <w:widowControl/>
-      </w:pPr>
-      <w:r>
-        <w:rPr>
-          <w:rFonts w:ascii="Times New Roman" w:hAnsi="Times New Roman" w:eastAsia="Times New Roman" w:cs="Times New Roman"/>
-          <w:color w:val="000000"/>
-          <w:sz w:val="24"/>
-        </w:rPr>
-        <w:t>Hill (</w:t>
-      </w:r>
-      <m:oMath>
-        <m:box>
-          <m:e>
-            <m:r>
-              <m:rPr>
-                <m:sty m:val="i"/>
-              </m:rPr>
-              <m:t>d</m:t>
-            </m:r>
-            <m:r>
-              <m:rPr>
-                <m:sty m:val="p"/>
-              </m:rPr>
-              <m:t>=</m:t>
-            </m:r>
-            <m:r>
-              <m:rPr>
-                <m:sty m:val="p"/>
-              </m:rPr>
-              <m:t>6</m:t>
-            </m:r>
-          </m:e>
-        </m:box>
-      </m:oMath>
-      <w:r>
-        <w:rPr>
-          <w:rFonts w:ascii="Times New Roman" w:hAnsi="Times New Roman" w:eastAsia="Times New Roman" w:cs="Times New Roman"/>
-          <w:color w:val="000000"/>
-          <w:sz w:val="24"/>
-        </w:rPr>
-        <w:t xml:space="preserve">, </w:t>
-      </w:r>
-      <m:oMath>
-        <m:box>
-          <m:e>
-            <m:sSub>
-              <m:e>
-                <m:r>
-                  <m:rPr>
-                    <m:sty m:val="i"/>
-                  </m:rPr>
-                  <m:t>σ</m:t>
-                </m:r>
-              </m:e>
-              <m:sub>
-                <m:box>
-                  <m:e>
-                    <m:r>
-                      <m:rPr>
-                        <m:sty m:val="p"/>
-                      </m:rPr>
-                      <m:t>rel</m:t>
-                    </m:r>
-                  </m:e>
-                </m:box>
-              </m:sub>
-            </m:sSub>
-            <m:r>
-              <m:rPr>
-                <m:sty m:val="p"/>
-              </m:rPr>
-              <m:t>=</m:t>
-            </m:r>
-            <m:r>
-              <m:rPr>
-                <m:sty m:val="p"/>
-              </m:rPr>
-              <m:t>0.25</m:t>
-            </m:r>
-          </m:e>
-        </m:box>
-      </m:oMath>
-      <w:r>
-        <w:rPr>
-          <w:rFonts w:ascii="Times New Roman" w:hAnsi="Times New Roman" w:eastAsia="Times New Roman" w:cs="Times New Roman"/>
-          <w:color w:val="000000"/>
-          <w:sz w:val="24"/>
-        </w:rPr>
-        <w:t>) benchmark (</w:t>
-      </w:r>
-      <m:oMath>
-        <m:box>
-          <m:e>
-            <m:r>
-              <m:rPr>
-                <m:sty m:val="i"/>
-              </m:rPr>
-              <m:t>n</m:t>
-            </m:r>
-            <m:r>
-              <m:rPr>
-                <m:sty m:val="p"/>
-              </m:rPr>
-              <m:t>=</m:t>
-            </m:r>
-            <m:r>
-              <m:rPr>
-                <m:sty m:val="p"/>
-              </m:rPr>
-              <m:t>50</m:t>
-            </m:r>
-          </m:e>
-        </m:box>
-      </m:oMath>
-      <w:r>
-        <w:rPr>
-          <w:rFonts w:ascii="Times New Roman" w:hAnsi="Times New Roman" w:eastAsia="Times New Roman" w:cs="Times New Roman"/>
-          <w:color w:val="000000"/>
-          <w:sz w:val="24"/>
-        </w:rPr>
-        <w:t xml:space="preserve"> paired campaigns per</w:t>
-      </w:r>
-    </w:p>
-    <w:p>
-      <w:pPr>
-        <w:widowControl/>
-      </w:pPr>
-      <w:r>
-        <w:rPr>
-          <w:rFonts w:ascii="Times New Roman" w:hAnsi="Times New Roman" w:eastAsia="Times New Roman" w:cs="Times New Roman"/>
-          <w:color w:val="000000"/>
-          <w:sz w:val="24"/>
-        </w:rPr>
-        <w:t>method). (B) Paired Rule P minus Rule A differences with 95% paired-bootstrap</w:t>
-      </w:r>
-    </w:p>
-    <w:p>
-      <w:pPr>
-        <w:widowControl/>
-      </w:pPr>
-      <w:r>
-        <w:rPr>
-          <w:rFonts w:ascii="Times New Roman" w:hAnsi="Times New Roman" w:eastAsia="Times New Roman" w:cs="Times New Roman"/>
-          <w:color w:val="000000"/>
-          <w:sz w:val="24"/>
-        </w:rPr>
-        <w:t>intervals; negative values favor Rule P. SPADE shows the largest reduction</w:t>
-      </w:r>
-    </w:p>
-    <w:p>
-      <w:pPr>
-        <w:widowControl/>
-      </w:pPr>
-      <w:r>
-        <w:rPr>
-          <w:rFonts w:ascii="Times New Roman" w:hAnsi="Times New Roman" w:eastAsia="Times New Roman" w:cs="Times New Roman"/>
-          <w:color w:val="000000"/>
-          <w:sz w:val="24"/>
-        </w:rPr>
-        <w:t>(</w:t>
-      </w:r>
-      <w:r>
-        <w:rPr>
-          <w:rFonts w:ascii="Courier New" w:hAnsi="Courier New" w:eastAsia="Courier New" w:cs="Courier New"/>
-          <w:color w:val="000000"/>
-          <w:sz w:val="22"/>
-        </w:rPr>
-        <w:t>-0.0543</w:t>
-      </w:r>
-      <w:r>
-        <w:rPr>
-          <w:rFonts w:ascii="Times New Roman" w:hAnsi="Times New Roman" w:eastAsia="Times New Roman" w:cs="Times New Roman"/>
-          <w:color w:val="000000"/>
-          <w:sz w:val="24"/>
-        </w:rPr>
-        <w:t>), whereas the classical design increases regret (</w:t>
-      </w:r>
-      <w:r>
-        <w:rPr>
-          <w:rFonts w:ascii="Courier New" w:hAnsi="Courier New" w:eastAsia="Courier New" w:cs="Courier New"/>
-          <w:color w:val="000000"/>
-          <w:sz w:val="22"/>
-        </w:rPr>
-        <w:t>+0.1035</w:t>
-      </w:r>
-      <w:r>
-        <w:rPr>
-          <w:rFonts w:ascii="Times New Roman" w:hAnsi="Times New Roman" w:eastAsia="Times New Roman" w:cs="Times New Roman"/>
-          <w:color w:val="000000"/>
-          <w:sz w:val="24"/>
-        </w:rPr>
-        <w:t>) under the</w:t>
-      </w:r>
-    </w:p>
-    <w:p>
-      <w:pPr>
-        <w:widowControl/>
-      </w:pPr>
-      <w:r>
-        <w:rPr>
-          <w:rFonts w:ascii="Times New Roman" w:hAnsi="Times New Roman" w:eastAsia="Times New Roman" w:cs="Times New Roman"/>
-          <w:color w:val="000000"/>
-          <w:sz w:val="24"/>
-        </w:rPr>
-        <w:t>shared GP readout. (C) For compatible arms, Rule-A regret is decomposed into</w:t>
-      </w:r>
-    </w:p>
-    <w:p>
-      <w:pPr>
-        <w:widowControl/>
-      </w:pPr>
-      <w:r>
-        <w:rPr>
-          <w:rFonts w:ascii="Times New Roman" w:hAnsi="Times New Roman" w:eastAsia="Times New Roman" w:cs="Times New Roman"/>
-          <w:color w:val="000000"/>
-          <w:sz w:val="24"/>
-        </w:rPr>
-        <w:t>search loss and identification loss. The ±0.02 smallest-effect band is not on</w:t>
-      </w:r>
-    </w:p>
-    <w:p>
-      <w:pPr>
-        <w:widowControl/>
-      </w:pPr>
-      <w:r>
-        <w:rPr>
-          <w:rFonts w:ascii="Times New Roman" w:hAnsi="Times New Roman" w:eastAsia="Times New Roman" w:cs="Times New Roman"/>
-          <w:color w:val="000000"/>
-          <w:sz w:val="24"/>
-        </w:rPr>
-        <w:t>this plot; it belongs to the map-error contrasts below.</w:t>
-      </w:r>
-    </w:p>
-    <w:p>
-      <w:pPr>
-        <w:keepNext/>
-        <w:spacing w:before="120" w:after="60" w:line="240" w:lineRule="auto"/>
-        <w:jc w:val="center"/>
-      </w:pPr>
-      <w:r>
-        <w:drawing>
-          <wp:inline xmlns:a="http://schemas.openxmlformats.org/drawingml/2006/main" xmlns:pic="http://schemas.openxmlformats.org/drawingml/2006/picture">
-            <wp:extent cx="5897880" cy="5493839"/>
+            <wp:extent cx="5897880" cy="2833940"/>
             <wp:docPr id="3" name="Picture 3"/>
             <wp:cNvGraphicFramePr>
               <a:graphicFrameLocks noChangeAspect="1"/>
@@ -5159,7 +4820,7 @@
                   <pic:spPr>
                     <a:xfrm>
                       <a:off x="0" y="0"/>
-                      <a:ext cx="5897880" cy="5493839"/>
+                      <a:ext cx="5897880" cy="2833940"/>
                     </a:xfrm>
                     <a:prstGeom prst="rect"/>
                   </pic:spPr>
@@ -5178,10 +4839,11 @@
       <w:r>
         <w:rPr>
           <w:rFonts w:ascii="Times New Roman" w:hAnsi="Times New Roman" w:eastAsia="Times New Roman" w:cs="Times New Roman"/>
+          <w:b/>
           <w:color w:val="000000"/>
           <w:sz w:val="20"/>
         </w:rPr>
-        <w:t>**Fig 3. Historical supporting evidence: registered-target map error versus Rule-P</w:t>
+        <w:t>Fig 3. Point-recipe trade-off (secondary to the region decision). (A) SPADE at five rounds minus qLogNEI at ten rounds on simple regret: no detectable difference (−0.0005, 95% CI [−0.0221, +0.0207], n=160); not claimed as equivalence. (B) SPADE at five rounds minus screened DoE at three rounds: DoE finds the better single recipe (+0.1026, 95% CI [+0.0486, +0.1578]); expected when the goal is one point rather than a region.</w:t>
       </w:r>
     </w:p>
     <w:p>
@@ -5194,268 +4856,7 @@
           <w:color w:val="000000"/>
           <w:sz w:val="24"/>
         </w:rPr>
-        <w:t>regret, not matched-round certified volume.** (A) Registered Hill-target means for</w:t>
-      </w:r>
-    </w:p>
-    <w:p>
-      <w:pPr>
-        <w:widowControl/>
-      </w:pPr>
-      <w:r>
-        <w:rPr>
-          <w:rFonts w:ascii="Times New Roman" w:hAnsi="Times New Roman" w:eastAsia="Times New Roman" w:cs="Times New Roman"/>
-          <w:color w:val="000000"/>
-          <w:sz w:val="24"/>
-        </w:rPr>
-        <w:t>symmetric-difference map error and Rule-P simple regret (</w:t>
-      </w:r>
-      <m:oMath>
-        <m:box>
-          <m:e>
-            <m:r>
-              <m:rPr>
-                <m:sty m:val="i"/>
-              </m:rPr>
-              <m:t>n</m:t>
-            </m:r>
-            <m:r>
-              <m:rPr>
-                <m:sty m:val="p"/>
-              </m:rPr>
-              <m:t>=</m:t>
-            </m:r>
-            <m:r>
-              <m:rPr>
-                <m:sty m:val="p"/>
-              </m:rPr>
-              <m:t>25</m:t>
-            </m:r>
-          </m:e>
-        </m:box>
-      </m:oMath>
-      <w:r>
-        <w:rPr>
-          <w:rFonts w:ascii="Times New Roman" w:hAnsi="Times New Roman" w:eastAsia="Times New Roman" w:cs="Times New Roman"/>
-          <w:color w:val="000000"/>
-          <w:sz w:val="24"/>
-        </w:rPr>
-        <w:t xml:space="preserve"> landscape-level</w:t>
-      </w:r>
-    </w:p>
-    <w:p>
-      <w:pPr>
-        <w:widowControl/>
-      </w:pPr>
-      <w:r>
-        <w:rPr>
-          <w:rFonts w:ascii="Times New Roman" w:hAnsi="Times New Roman" w:eastAsia="Times New Roman" w:cs="Times New Roman"/>
-          <w:color w:val="000000"/>
-          <w:sz w:val="24"/>
-        </w:rPr>
-        <w:t>means per method); lower is better on both axes. (B) Paired SPADE-minus-comparator</w:t>
-      </w:r>
-    </w:p>
-    <w:p>
-      <w:pPr>
-        <w:widowControl/>
-      </w:pPr>
-      <w:r>
-        <w:rPr>
-          <w:rFonts w:ascii="Times New Roman" w:hAnsi="Times New Roman" w:eastAsia="Times New Roman" w:cs="Times New Roman"/>
-          <w:color w:val="000000"/>
-          <w:sz w:val="24"/>
-        </w:rPr>
-        <w:t>contrasts with 95% intervals and the prespecified ±0.02 smallest effect size of</w:t>
-      </w:r>
-    </w:p>
-    <w:p>
-      <w:pPr>
-        <w:widowControl/>
-      </w:pPr>
-      <w:r>
-        <w:rPr>
-          <w:rFonts w:ascii="Times New Roman" w:hAnsi="Times New Roman" w:eastAsia="Times New Roman" w:cs="Times New Roman"/>
-          <w:color w:val="000000"/>
-          <w:sz w:val="24"/>
-        </w:rPr>
-        <w:t>interest (shaded band). SPADE has lower map error than Sobol (</w:t>
-      </w:r>
-      <w:r>
-        <w:rPr>
-          <w:rFonts w:ascii="Courier New" w:hAnsi="Courier New" w:eastAsia="Courier New" w:cs="Courier New"/>
-          <w:color w:val="000000"/>
-          <w:sz w:val="22"/>
-        </w:rPr>
-        <w:t>-0.0109</w:t>
-      </w:r>
-      <w:r>
-        <w:rPr>
-          <w:rFonts w:ascii="Times New Roman" w:hAnsi="Times New Roman" w:eastAsia="Times New Roman" w:cs="Times New Roman"/>
-          <w:color w:val="000000"/>
-          <w:sz w:val="24"/>
-        </w:rPr>
-        <w:t>) and</w:t>
-      </w:r>
-    </w:p>
-    <w:p>
-      <w:pPr>
-        <w:widowControl/>
-      </w:pPr>
-      <w:r>
-        <w:rPr>
-          <w:rFonts w:ascii="Times New Roman" w:hAnsi="Times New Roman" w:eastAsia="Times New Roman" w:cs="Times New Roman"/>
-          <w:color w:val="000000"/>
-          <w:sz w:val="24"/>
-        </w:rPr>
-        <w:t>qLogNEI (</w:t>
-      </w:r>
-      <w:r>
-        <w:rPr>
-          <w:rFonts w:ascii="Courier New" w:hAnsi="Courier New" w:eastAsia="Courier New" w:cs="Courier New"/>
-          <w:color w:val="000000"/>
-          <w:sz w:val="22"/>
-        </w:rPr>
-        <w:t>-0.0327</w:t>
-      </w:r>
-      <w:r>
-        <w:rPr>
-          <w:rFonts w:ascii="Times New Roman" w:hAnsi="Times New Roman" w:eastAsia="Times New Roman" w:cs="Times New Roman"/>
-          <w:color w:val="000000"/>
-          <w:sz w:val="24"/>
-        </w:rPr>
-        <w:t xml:space="preserve">), while Rule-P regret is </w:t>
-      </w:r>
-      <w:r>
-        <w:rPr>
-          <w:rFonts w:ascii="Courier New" w:hAnsi="Courier New" w:eastAsia="Courier New" w:cs="Courier New"/>
-          <w:color w:val="000000"/>
-          <w:sz w:val="22"/>
-        </w:rPr>
-        <w:t>+0.0094</w:t>
-      </w:r>
-      <w:r>
-        <w:rPr>
-          <w:rFonts w:ascii="Times New Roman" w:hAnsi="Times New Roman" w:eastAsia="Times New Roman" w:cs="Times New Roman"/>
-          <w:color w:val="000000"/>
-          <w:sz w:val="24"/>
-        </w:rPr>
-        <w:t xml:space="preserve"> relative to qLogNEI.</w:t>
-      </w:r>
-    </w:p>
-    <w:p>
-      <w:pPr>
-        <w:widowControl/>
-      </w:pPr>
-      <w:r>
-        <w:rPr>
-          <w:rFonts w:ascii="Times New Roman" w:hAnsi="Times New Roman" w:eastAsia="Times New Roman" w:cs="Times New Roman"/>
-          <w:color w:val="000000"/>
-          <w:sz w:val="24"/>
-        </w:rPr>
-        <w:t>(C) Every equal-budget method consumes 48 wells, but feedback ranges from one to</w:t>
-      </w:r>
-    </w:p>
-    <w:p>
-      <w:pPr>
-        <w:widowControl/>
-      </w:pPr>
-      <w:r>
-        <w:rPr>
-          <w:rFonts w:ascii="Times New Roman" w:hAnsi="Times New Roman" w:eastAsia="Times New Roman" w:cs="Times New Roman"/>
-          <w:color w:val="000000"/>
-          <w:sz w:val="24"/>
-        </w:rPr>
-        <w:t>ten rounds. (D) Hartmann (</w:t>
-      </w:r>
-      <m:oMath>
-        <m:box>
-          <m:e>
-            <m:r>
-              <m:rPr>
-                <m:sty m:val="i"/>
-              </m:rPr>
-              <m:t>d</m:t>
-            </m:r>
-            <m:r>
-              <m:rPr>
-                <m:sty m:val="p"/>
-              </m:rPr>
-              <m:t>=</m:t>
-            </m:r>
-            <m:r>
-              <m:rPr>
-                <m:sty m:val="p"/>
-              </m:rPr>
-              <m:t>6</m:t>
-            </m:r>
-          </m:e>
-        </m:box>
-      </m:oMath>
-      <w:r>
-        <w:rPr>
-          <w:rFonts w:ascii="Times New Roman" w:hAnsi="Times New Roman" w:eastAsia="Times New Roman" w:cs="Times New Roman"/>
-          <w:color w:val="000000"/>
-          <w:sz w:val="24"/>
-        </w:rPr>
-        <w:t xml:space="preserve"> and </w:t>
-      </w:r>
-      <m:oMath>
-        <m:box>
-          <m:e>
-            <m:r>
-              <m:rPr>
-                <m:sty m:val="i"/>
-              </m:rPr>
-              <m:t>d</m:t>
-            </m:r>
-            <m:r>
-              <m:rPr>
-                <m:sty m:val="p"/>
-              </m:rPr>
-              <m:t>=</m:t>
-            </m:r>
-            <m:r>
-              <m:rPr>
-                <m:sty m:val="p"/>
-              </m:rPr>
-              <m:t>8</m:t>
-            </m:r>
-          </m:e>
-        </m:box>
-      </m:oMath>
-      <w:r>
-        <w:rPr>
-          <w:rFonts w:ascii="Times New Roman" w:hAnsi="Times New Roman" w:eastAsia="Times New Roman" w:cs="Times New Roman"/>
-          <w:color w:val="000000"/>
-          <w:sz w:val="24"/>
-        </w:rPr>
-        <w:t>) robustness values are descriptive</w:t>
-      </w:r>
-    </w:p>
-    <w:p>
-      <w:pPr>
-        <w:widowControl/>
-      </w:pPr>
-      <w:r>
-        <w:rPr>
-          <w:rFonts w:ascii="Times New Roman" w:hAnsi="Times New Roman" w:eastAsia="Times New Roman" w:cs="Times New Roman"/>
-          <w:color w:val="000000"/>
-          <w:sz w:val="24"/>
-        </w:rPr>
-        <w:t>means; intervals are unavailable. This plot is archived map-and-cost evidence,</w:t>
-      </w:r>
-    </w:p>
-    <w:p>
-      <w:pPr>
-        <w:widowControl/>
-      </w:pPr>
-      <w:r>
-        <w:rPr>
-          <w:rFonts w:ascii="Times New Roman" w:hAnsi="Times New Roman" w:eastAsia="Times New Roman" w:cs="Times New Roman"/>
-          <w:color w:val="000000"/>
-          <w:sz w:val="24"/>
-        </w:rPr>
-        <w:t>not the C3 certified-volume comparison.</w:t>
+        <w:t>Fig 2. Point-recipe contrasts from the one-process DC comparison. (A) SPADE at five rounds minus qLogNEI at ten rounds on simple regret (n=160); shaded band is ±0.02. The estimate shows no detectable difference and does not establish equivalence. (B) SPADE at five rounds minus screened DoE at three rounds; DoE finds the better point recipe.</w:t>
       </w:r>
     </w:p>
     <w:p>
@@ -6677,259 +6078,6 @@
     </w:p>
     <w:p>
       <w:pPr>
-        <w:pStyle w:val="Heading2"/>
-        <w:widowControl/>
-      </w:pPr>
-      <w:r>
-        <w:rPr>
-          <w:rFonts w:ascii="Times New Roman" w:hAnsi="Times New Roman" w:eastAsia="Times New Roman" w:cs="Times New Roman"/>
-          <w:color w:val="000000"/>
-          <w:sz w:val="24"/>
-        </w:rPr>
-        <w:t>Certifiability depended on family, prevalence, and margin-to-noise</w:t>
-      </w:r>
-    </w:p>
-    <w:p>
-      <w:pPr>
-        <w:widowControl/>
-      </w:pPr>
-      <w:r>
-        <w:rPr>
-          <w:rFonts w:ascii="Times New Roman" w:hAnsi="Times New Roman" w:eastAsia="Times New Roman" w:cs="Times New Roman"/>
-          <w:color w:val="000000"/>
-          <w:sz w:val="24"/>
-        </w:rPr>
-        <w:t>Across five families and prevalences 0.70, 0.50, 0.30, 0.20, and 0.10, SPADE answer</w:t>
-      </w:r>
-    </w:p>
-    <w:p>
-      <w:pPr>
-        <w:widowControl/>
-      </w:pPr>
-      <w:r>
-        <w:rPr>
-          <w:rFonts w:ascii="Times New Roman" w:hAnsi="Times New Roman" w:eastAsia="Times New Roman" w:cs="Times New Roman"/>
-          <w:color w:val="000000"/>
-          <w:sz w:val="24"/>
-        </w:rPr>
-        <w:t xml:space="preserve">rate at </w:t>
-      </w:r>
-      <w:r>
-        <w:rPr>
-          <w:rFonts w:ascii="Courier New" w:hAnsi="Courier New" w:eastAsia="Courier New" w:cs="Courier New"/>
-          <w:color w:val="000000"/>
-          <w:sz w:val="22"/>
-        </w:rPr>
-        <w:t>c=1</w:t>
-      </w:r>
-      <w:r>
-        <w:rPr>
-          <w:rFonts w:ascii="Times New Roman" w:hAnsi="Times New Roman" w:eastAsia="Times New Roman" w:cs="Times New Roman"/>
-          <w:color w:val="000000"/>
-          <w:sz w:val="24"/>
-        </w:rPr>
-        <w:t xml:space="preserve">, </w:t>
-      </w:r>
-      <w:r>
-        <w:rPr>
-          <w:rFonts w:ascii="Courier New" w:hAnsi="Courier New" w:eastAsia="Courier New" w:cs="Courier New"/>
-          <w:color w:val="000000"/>
-          <w:sz w:val="22"/>
-        </w:rPr>
-        <w:t>alpha=0.95</w:t>
-      </w:r>
-      <w:r>
-        <w:rPr>
-          <w:rFonts w:ascii="Times New Roman" w:hAnsi="Times New Roman" w:eastAsia="Times New Roman" w:cs="Times New Roman"/>
-          <w:color w:val="000000"/>
-          <w:sz w:val="24"/>
-        </w:rPr>
-        <w:t xml:space="preserve">, 48 wells, R5, relative noise </w:t>
-      </w:r>
-      <w:r>
-        <w:rPr>
-          <w:rFonts w:ascii="Courier New" w:hAnsi="Courier New" w:eastAsia="Courier New" w:cs="Courier New"/>
-          <w:color w:val="000000"/>
-          <w:sz w:val="22"/>
-        </w:rPr>
-        <w:t>0.25</w:t>
-      </w:r>
-      <w:r>
-        <w:rPr>
-          <w:rFonts w:ascii="Times New Roman" w:hAnsi="Times New Roman" w:eastAsia="Times New Roman" w:cs="Times New Roman"/>
-          <w:color w:val="000000"/>
-          <w:sz w:val="24"/>
-        </w:rPr>
-        <w:t>, and 64 seeds per</w:t>
-      </w:r>
-    </w:p>
-    <w:p>
-      <w:pPr>
-        <w:widowControl/>
-      </w:pPr>
-      <w:r>
-        <w:rPr>
-          <w:rFonts w:ascii="Times New Roman" w:hAnsi="Times New Roman" w:eastAsia="Times New Roman" w:cs="Times New Roman"/>
-          <w:color w:val="000000"/>
-          <w:sz w:val="24"/>
-        </w:rPr>
-        <w:t>family was descriptively associated with mean seed-specific true margin-to-noise</w:t>
-      </w:r>
-    </w:p>
-    <w:p>
-      <w:pPr>
-        <w:widowControl/>
-      </w:pPr>
-      <w:r>
-        <w:rPr>
-          <w:rFonts w:ascii="Times New Roman" w:hAnsi="Times New Roman" w:eastAsia="Times New Roman" w:cs="Times New Roman"/>
-          <w:color w:val="000000"/>
-          <w:sz w:val="24"/>
-        </w:rPr>
-        <w:t xml:space="preserve">(Spearman rho </w:t>
-      </w:r>
-      <w:r>
-        <w:rPr>
-          <w:rFonts w:ascii="Courier New" w:hAnsi="Courier New" w:eastAsia="Courier New" w:cs="Courier New"/>
-          <w:color w:val="000000"/>
-          <w:sz w:val="22"/>
-        </w:rPr>
-        <w:t>0.9880098603391883</w:t>
-      </w:r>
-      <w:r>
-        <w:rPr>
-          <w:rFonts w:ascii="Times New Roman" w:hAnsi="Times New Roman" w:eastAsia="Times New Roman" w:cs="Times New Roman"/>
-          <w:color w:val="000000"/>
-          <w:sz w:val="24"/>
-        </w:rPr>
-        <w:t>; 25 nested family-prevalence cells). The diagnostic</w:t>
-      </w:r>
-    </w:p>
-    <w:p>
-      <w:pPr>
-        <w:widowControl/>
-      </w:pPr>
-      <w:r>
-        <w:rPr>
-          <w:rFonts w:ascii="Times New Roman" w:hAnsi="Times New Roman" w:eastAsia="Times New Roman" w:cs="Times New Roman"/>
-          <w:color w:val="000000"/>
-          <w:sz w:val="24"/>
-        </w:rPr>
-        <w:t>uses latent truth and is explanatory, not available prospectively. Shared families and</w:t>
-      </w:r>
-    </w:p>
-    <w:p>
-      <w:pPr>
-        <w:widowControl/>
-      </w:pPr>
-      <w:r>
-        <w:rPr>
-          <w:rFonts w:ascii="Times New Roman" w:hAnsi="Times New Roman" w:eastAsia="Times New Roman" w:cs="Times New Roman"/>
-          <w:color w:val="000000"/>
-          <w:sz w:val="24"/>
-        </w:rPr>
-        <w:t>ordered prevalences make the cells dependent and nonexchangeable.</w:t>
-      </w:r>
-    </w:p>
-    <w:p>
-      <w:pPr>
-        <w:widowControl/>
-      </w:pPr>
-      <w:r>
-        <w:rPr>
-          <w:rFonts w:ascii="Times New Roman" w:hAnsi="Times New Roman" w:eastAsia="Times New Roman" w:cs="Times New Roman"/>
-          <w:color w:val="000000"/>
-          <w:sz w:val="24"/>
-        </w:rPr>
-        <w:t xml:space="preserve">For the biology-shaped but synthetic Hill family at prevalence </w:t>
-      </w:r>
-      <w:r>
-        <w:rPr>
-          <w:rFonts w:ascii="Courier New" w:hAnsi="Courier New" w:eastAsia="Courier New" w:cs="Courier New"/>
-          <w:color w:val="000000"/>
-          <w:sz w:val="22"/>
-        </w:rPr>
-        <w:t>0.70</w:t>
-      </w:r>
-      <w:r>
-        <w:rPr>
-          <w:rFonts w:ascii="Times New Roman" w:hAnsi="Times New Roman" w:eastAsia="Times New Roman" w:cs="Times New Roman"/>
-          <w:color w:val="000000"/>
-          <w:sz w:val="24"/>
-        </w:rPr>
-        <w:t>, under those</w:t>
-      </w:r>
-    </w:p>
-    <w:p>
-      <w:pPr>
-        <w:widowControl/>
-      </w:pPr>
-      <w:r>
-        <w:rPr>
-          <w:rFonts w:ascii="Times New Roman" w:hAnsi="Times New Roman" w:eastAsia="Times New Roman" w:cs="Times New Roman"/>
-          <w:color w:val="000000"/>
-          <w:sz w:val="24"/>
-        </w:rPr>
-        <w:t>same settings, SPADE answered 40/64 and contained truth in 40/40 (ordinary-binomial</w:t>
-      </w:r>
-    </w:p>
-    <w:p>
-      <w:pPr>
-        <w:widowControl/>
-      </w:pPr>
-      <w:r>
-        <w:rPr>
-          <w:rFonts w:ascii="Times New Roman" w:hAnsi="Times New Roman" w:eastAsia="Times New Roman" w:cs="Times New Roman"/>
-          <w:color w:val="000000"/>
-          <w:sz w:val="24"/>
-        </w:rPr>
-        <w:t xml:space="preserve">lower bound </w:t>
-      </w:r>
-      <w:r>
-        <w:rPr>
-          <w:rFonts w:ascii="Courier New" w:hAnsi="Courier New" w:eastAsia="Courier New" w:cs="Courier New"/>
-          <w:color w:val="000000"/>
-          <w:sz w:val="22"/>
-        </w:rPr>
-        <w:t>0.9278</w:t>
-      </w:r>
-      <w:r>
-        <w:rPr>
-          <w:rFonts w:ascii="Times New Roman" w:hAnsi="Times New Roman" w:eastAsia="Times New Roman" w:cs="Times New Roman"/>
-          <w:color w:val="000000"/>
-          <w:sz w:val="24"/>
-        </w:rPr>
-        <w:t>). qLogNEI answered 27/64 and contained 27/27; its limitation was</w:t>
-      </w:r>
-    </w:p>
-    <w:p>
-      <w:pPr>
-        <w:widowControl/>
-      </w:pPr>
-      <w:r>
-        <w:rPr>
-          <w:rFonts w:ascii="Times New Roman" w:hAnsi="Times New Roman" w:eastAsia="Times New Roman" w:cs="Times New Roman"/>
-          <w:color w:val="000000"/>
-          <w:sz w:val="24"/>
-        </w:rPr>
-        <w:t>the answer count required by the registered gate, not failure to return contained</w:t>
-      </w:r>
-    </w:p>
-    <w:p>
-      <w:pPr>
-        <w:widowControl/>
-      </w:pPr>
-      <w:r>
-        <w:rPr>
-          <w:rFonts w:ascii="Times New Roman" w:hAnsi="Times New Roman" w:eastAsia="Times New Roman" w:cs="Times New Roman"/>
-          <w:color w:val="000000"/>
-          <w:sz w:val="24"/>
-        </w:rPr>
-        <w:t>regions.</w:t>
-      </w:r>
-    </w:p>
-    <w:p>
-      <w:pPr>
         <w:keepNext/>
         <w:spacing w:before="120" w:after="60" w:line="240" w:lineRule="auto"/>
         <w:jc w:val="center"/>
@@ -6937,7 +6085,7 @@
       <w:r>
         <w:drawing>
           <wp:inline xmlns:a="http://schemas.openxmlformats.org/drawingml/2006/main" xmlns:pic="http://schemas.openxmlformats.org/drawingml/2006/picture">
-            <wp:extent cx="5897880" cy="5561179"/>
+            <wp:extent cx="5897880" cy="2373376"/>
             <wp:docPr id="4" name="Picture 4"/>
             <wp:cNvGraphicFramePr>
               <a:graphicFrameLocks noChangeAspect="1"/>
@@ -6958,7 +6106,7 @@
                   <pic:spPr>
                     <a:xfrm>
                       <a:off x="0" y="0"/>
-                      <a:ext cx="5897880" cy="5561179"/>
+                      <a:ext cx="5897880" cy="2373376"/>
                     </a:xfrm>
                     <a:prstGeom prst="rect"/>
                   </pic:spPr>
@@ -6977,14 +6125,16 @@
       <w:r>
         <w:rPr>
           <w:rFonts w:ascii="Times New Roman" w:hAnsi="Times New Roman" w:eastAsia="Times New Roman" w:cs="Times New Roman"/>
+          <w:b/>
           <w:color w:val="000000"/>
           <w:sz w:val="20"/>
         </w:rPr>
-        <w:t>**Fig 4. Historical supporting evidence: calibration, posterior self-consistency,</w:t>
-      </w:r>
-    </w:p>
-    <w:p>
-      <w:pPr>
+        <w:t>Fig 4. Additional locked SPADE evidence. (A) At three rounds SPADE has lower regret than one-shot Latin hypercube sampling (SPADE−LHS −0.0783; shown as positive SPADE advantage). (B) On the biology-shaped Hill family at prevalence 0.70, SPADE answers 40/64 trusted regions versus 27/64 for qLogNEI; both arms contain truth in every answered cell.</w:t>
+      </w:r>
+    </w:p>
+    <w:p>
+      <w:pPr>
+        <w:pStyle w:val="Heading2"/>
         <w:widowControl/>
       </w:pPr>
       <w:r>
@@ -6993,7 +6143,7 @@
           <w:color w:val="000000"/>
           <w:sz w:val="24"/>
         </w:rPr>
-        <w:t>and answer-rate summaries, not C3 certified volume.** (A) Retrospective Hill</w:t>
+        <w:t>Certifiability depended on family, prevalence, and margin-to-noise</w:t>
       </w:r>
     </w:p>
     <w:p>
@@ -7006,55 +6156,7 @@
           <w:color w:val="000000"/>
           <w:sz w:val="24"/>
         </w:rPr>
-        <w:t>calibration error and refinement are descriptive summaries (</w:t>
-      </w:r>
-      <m:oMath>
-        <m:box>
-          <m:e>
-            <m:r>
-              <m:rPr>
-                <m:sty m:val="i"/>
-              </m:rPr>
-              <m:t>n</m:t>
-            </m:r>
-            <m:r>
-              <m:rPr>
-                <m:sty m:val="p"/>
-              </m:rPr>
-              <m:t>=</m:t>
-            </m:r>
-            <m:r>
-              <m:rPr>
-                <m:sty m:val="p"/>
-              </m:rPr>
-              <m:t>1</m:t>
-            </m:r>
-            <m:box>
-              <m:e>
-                <m:r>
-                  <m:rPr>
-                    <m:sty m:val="p"/>
-                  </m:rPr>
-                  <m:t>,</m:t>
-                </m:r>
-              </m:e>
-            </m:box>
-            <m:r>
-              <m:rPr>
-                <m:sty m:val="p"/>
-              </m:rPr>
-              <m:t>200</m:t>
-            </m:r>
-          </m:e>
-        </m:box>
-      </m:oMath>
-      <w:r>
-        <w:rPr>
-          <w:rFonts w:ascii="Times New Roman" w:hAnsi="Times New Roman" w:eastAsia="Times New Roman" w:cs="Times New Roman"/>
-          <w:color w:val="000000"/>
-          <w:sz w:val="24"/>
-        </w:rPr>
-        <w:t xml:space="preserve"> repeated</w:t>
+        <w:t>Across five families and prevalences 0.70, 0.50, 0.30, 0.20, and 0.10, SPADE answer</w:t>
       </w:r>
     </w:p>
     <w:p>
@@ -7067,7 +6169,55 @@
           <w:color w:val="000000"/>
           <w:sz w:val="24"/>
         </w:rPr>
-        <w:t>threshold cells per method). (B) Prospective Hill fractions of non-empty campaigns</w:t>
+        <w:t xml:space="preserve">rate at </w:t>
+      </w:r>
+      <w:r>
+        <w:rPr>
+          <w:rFonts w:ascii="Courier New" w:hAnsi="Courier New" w:eastAsia="Courier New" w:cs="Courier New"/>
+          <w:color w:val="000000"/>
+          <w:sz w:val="22"/>
+        </w:rPr>
+        <w:t>c=1</w:t>
+      </w:r>
+      <w:r>
+        <w:rPr>
+          <w:rFonts w:ascii="Times New Roman" w:hAnsi="Times New Roman" w:eastAsia="Times New Roman" w:cs="Times New Roman"/>
+          <w:color w:val="000000"/>
+          <w:sz w:val="24"/>
+        </w:rPr>
+        <w:t xml:space="preserve">, </w:t>
+      </w:r>
+      <w:r>
+        <w:rPr>
+          <w:rFonts w:ascii="Courier New" w:hAnsi="Courier New" w:eastAsia="Courier New" w:cs="Courier New"/>
+          <w:color w:val="000000"/>
+          <w:sz w:val="22"/>
+        </w:rPr>
+        <w:t>alpha=0.95</w:t>
+      </w:r>
+      <w:r>
+        <w:rPr>
+          <w:rFonts w:ascii="Times New Roman" w:hAnsi="Times New Roman" w:eastAsia="Times New Roman" w:cs="Times New Roman"/>
+          <w:color w:val="000000"/>
+          <w:sz w:val="24"/>
+        </w:rPr>
+        <w:t xml:space="preserve">, 48 wells, R5, relative noise </w:t>
+      </w:r>
+      <w:r>
+        <w:rPr>
+          <w:rFonts w:ascii="Courier New" w:hAnsi="Courier New" w:eastAsia="Courier New" w:cs="Courier New"/>
+          <w:color w:val="000000"/>
+          <w:sz w:val="22"/>
+        </w:rPr>
+        <w:t>0.25</w:t>
+      </w:r>
+      <w:r>
+        <w:rPr>
+          <w:rFonts w:ascii="Times New Roman" w:hAnsi="Times New Roman" w:eastAsia="Times New Roman" w:cs="Times New Roman"/>
+          <w:color w:val="000000"/>
+          <w:sz w:val="24"/>
+        </w:rPr>
+        <w:t>, and 64 seeds per</w:t>
       </w:r>
     </w:p>
     <w:p>
@@ -7080,27 +6230,7 @@
           <w:color w:val="000000"/>
           <w:sz w:val="24"/>
         </w:rPr>
-        <w:t xml:space="preserve">meeting the held-out posterior check, minus </w:t>
-      </w:r>
-      <m:oMath>
-        <m:box>
-          <m:e>
-            <m:r>
-              <m:rPr>
-                <m:sty m:val="i"/>
-              </m:rPr>
-              <m:t>α</m:t>
-            </m:r>
-          </m:e>
-        </m:box>
-      </m:oMath>
-      <w:r>
-        <w:rPr>
-          <w:rFonts w:ascii="Times New Roman" w:hAnsi="Times New Roman" w:eastAsia="Times New Roman" w:cs="Times New Roman"/>
-          <w:color w:val="000000"/>
-          <w:sz w:val="24"/>
-        </w:rPr>
-        <w:t>; this is posterior</w:t>
+        <w:t>family was descriptively associated with mean seed-specific true margin-to-noise</w:t>
       </w:r>
     </w:p>
     <w:p>
@@ -7113,7 +6243,23 @@
           <w:color w:val="000000"/>
           <w:sz w:val="24"/>
         </w:rPr>
-        <w:t>self-consistency, not empirical containment against the oracle. Original 95%</w:t>
+        <w:t xml:space="preserve">(Spearman rho </w:t>
+      </w:r>
+      <w:r>
+        <w:rPr>
+          <w:rFonts w:ascii="Courier New" w:hAnsi="Courier New" w:eastAsia="Courier New" w:cs="Courier New"/>
+          <w:color w:val="000000"/>
+          <w:sz w:val="22"/>
+        </w:rPr>
+        <w:t>0.9880098603391883</w:t>
+      </w:r>
+      <w:r>
+        <w:rPr>
+          <w:rFonts w:ascii="Times New Roman" w:hAnsi="Times New Roman" w:eastAsia="Times New Roman" w:cs="Times New Roman"/>
+          <w:color w:val="000000"/>
+          <w:sz w:val="24"/>
+        </w:rPr>
+        <w:t>; 25 nested family-prevalence cells). The diagnostic</w:t>
       </w:r>
     </w:p>
     <w:p>
@@ -7126,7 +6272,7 @@
           <w:color w:val="000000"/>
           <w:sz w:val="24"/>
         </w:rPr>
-        <w:t>binomial intervals do not adjust for repeated Hill instances. (C) In the separate</w:t>
+        <w:t>uses latent truth and is explanatory, not available prospectively. Shared families and</w:t>
       </w:r>
     </w:p>
     <w:p>
@@ -7139,39 +6285,7 @@
           <w:color w:val="000000"/>
           <w:sz w:val="24"/>
         </w:rPr>
-        <w:t xml:space="preserve">retrospective five-family study at </w:t>
-      </w:r>
-      <m:oMath>
-        <m:box>
-          <m:e>
-            <m:r>
-              <m:rPr>
-                <m:sty m:val="i"/>
-              </m:rPr>
-              <m:t>α</m:t>
-            </m:r>
-            <m:r>
-              <m:rPr>
-                <m:sty m:val="p"/>
-              </m:rPr>
-              <m:t>=</m:t>
-            </m:r>
-            <m:r>
-              <m:rPr>
-                <m:sty m:val="p"/>
-              </m:rPr>
-              <m:t>0.95</m:t>
-            </m:r>
-          </m:e>
-        </m:box>
-      </m:oMath>
-      <w:r>
-        <w:rPr>
-          <w:rFonts w:ascii="Times New Roman" w:hAnsi="Times New Roman" w:eastAsia="Times New Roman" w:cs="Times New Roman"/>
-          <w:color w:val="000000"/>
-          <w:sz w:val="24"/>
-        </w:rPr>
-        <w:t>, campaigns returning any</w:t>
+        <w:t>ordered prevalences make the cells dependent and nonexchangeable.</w:t>
       </w:r>
     </w:p>
     <w:p>
@@ -7184,7 +6298,23 @@
           <w:color w:val="000000"/>
           <w:sz w:val="24"/>
         </w:rPr>
-        <w:t>non-empty certificate were 0/50 for Ackley, 11/50 for Hartmann6, 50/50 for Hill,</w:t>
+        <w:t xml:space="preserve">For the biology-shaped but synthetic Hill family at prevalence </w:t>
+      </w:r>
+      <w:r>
+        <w:rPr>
+          <w:rFonts w:ascii="Courier New" w:hAnsi="Courier New" w:eastAsia="Courier New" w:cs="Courier New"/>
+          <w:color w:val="000000"/>
+          <w:sz w:val="22"/>
+        </w:rPr>
+        <w:t>0.70</w:t>
+      </w:r>
+      <w:r>
+        <w:rPr>
+          <w:rFonts w:ascii="Times New Roman" w:hAnsi="Times New Roman" w:eastAsia="Times New Roman" w:cs="Times New Roman"/>
+          <w:color w:val="000000"/>
+          <w:sz w:val="24"/>
+        </w:rPr>
+        <w:t>, under those</w:t>
       </w:r>
     </w:p>
     <w:p>
@@ -7197,7 +6327,7 @@
           <w:color w:val="000000"/>
           <w:sz w:val="24"/>
         </w:rPr>
-        <w:t>49/50 for Levy, and 50/50 for Rosenbrock; zero denotes refusal to certify.</w:t>
+        <w:t>same settings, SPADE answered 40/64 and contained truth in 40/40 (ordinary-binomial</w:t>
       </w:r>
     </w:p>
     <w:p>
@@ -7210,39 +6340,23 @@
           <w:color w:val="000000"/>
           <w:sz w:val="24"/>
         </w:rPr>
-        <w:t xml:space="preserve">(D) Conditional containment at </w:t>
-      </w:r>
-      <m:oMath>
-        <m:box>
-          <m:e>
-            <m:r>
-              <m:rPr>
-                <m:sty m:val="i"/>
-              </m:rPr>
-              <m:t>α</m:t>
-            </m:r>
-            <m:r>
-              <m:rPr>
-                <m:sty m:val="p"/>
-              </m:rPr>
-              <m:t>=</m:t>
-            </m:r>
-            <m:r>
-              <m:rPr>
-                <m:sty m:val="p"/>
-              </m:rPr>
-              <m:t>0.80</m:t>
-            </m:r>
-          </m:e>
-        </m:box>
-      </m:oMath>
-      <w:r>
-        <w:rPr>
-          <w:rFonts w:ascii="Times New Roman" w:hAnsi="Times New Roman" w:eastAsia="Times New Roman" w:cs="Times New Roman"/>
-          <w:color w:val="000000"/>
-          <w:sz w:val="24"/>
-        </w:rPr>
-        <w:t xml:space="preserve"> pools dependent non-empty cells.</w:t>
+        <w:t xml:space="preserve">lower bound </w:t>
+      </w:r>
+      <w:r>
+        <w:rPr>
+          <w:rFonts w:ascii="Courier New" w:hAnsi="Courier New" w:eastAsia="Courier New" w:cs="Courier New"/>
+          <w:color w:val="000000"/>
+          <w:sz w:val="22"/>
+        </w:rPr>
+        <w:t>0.9278</w:t>
+      </w:r>
+      <w:r>
+        <w:rPr>
+          <w:rFonts w:ascii="Times New Roman" w:hAnsi="Times New Roman" w:eastAsia="Times New Roman" w:cs="Times New Roman"/>
+          <w:color w:val="000000"/>
+          <w:sz w:val="24"/>
+        </w:rPr>
+        <w:t>). qLogNEI answered 27/64 and contained 27/27; its limitation was</w:t>
       </w:r>
     </w:p>
     <w:p>
@@ -7255,7 +6369,20 @@
           <w:color w:val="000000"/>
           <w:sz w:val="24"/>
         </w:rPr>
-        <w:t>These archived certificate displays are not the C3 certified-volume comparison.</w:t>
+        <w:t>the answer count required by the registered gate, not failure to return contained</w:t>
+      </w:r>
+    </w:p>
+    <w:p>
+      <w:pPr>
+        <w:widowControl/>
+      </w:pPr>
+      <w:r>
+        <w:rPr>
+          <w:rFonts w:ascii="Times New Roman" w:hAnsi="Times New Roman" w:eastAsia="Times New Roman" w:cs="Times New Roman"/>
+          <w:color w:val="000000"/>
+          <w:sz w:val="24"/>
+        </w:rPr>
+        <w:t>regions.</w:t>
       </w:r>
     </w:p>
     <w:p>
@@ -10818,7 +9945,7 @@
           <w:color w:val="000000"/>
           <w:sz w:val="24"/>
         </w:rPr>
-        <w:t>The four retained PLOS figures are the only figure files cited here. Figures 2–4</w:t>
+        <w:t>Main text Figures 1–4 follow the region-first presentation: method selection (Fig 1),</w:t>
       </w:r>
     </w:p>
     <w:p>
@@ -10831,7 +9958,7 @@
           <w:color w:val="000000"/>
           <w:sz w:val="24"/>
         </w:rPr>
-        <w:t>are historical or supporting Hill terminal-rule, map-error, and certificate</w:t>
+        <w:t>SPADE’s certified-volume and containment advantage (Fig 2), the secondary point-recipe</w:t>
       </w:r>
     </w:p>
     <w:p>
@@ -10844,7 +9971,7 @@
           <w:color w:val="000000"/>
           <w:sz w:val="24"/>
         </w:rPr>
-        <w:t>displays; they are not C3 certified-volume evidence. That comparison remains</w:t>
+        <w:t>trade-off (Fig 3), and additional locked SPADE evidence C4/C6 (Fig 4). Numeric sources</w:t>
       </w:r>
     </w:p>
     <w:p>
@@ -10857,7 +9984,39 @@
           <w:color w:val="000000"/>
           <w:sz w:val="24"/>
         </w:rPr>
-        <w:t>Table 1.</w:t>
+        <w:t xml:space="preserve">are in </w:t>
+      </w:r>
+      <w:r>
+        <w:rPr>
+          <w:rFonts w:ascii="Courier New" w:hAnsi="Courier New" w:eastAsia="Courier New" w:cs="Courier New"/>
+          <w:color w:val="000000"/>
+          <w:sz w:val="22"/>
+        </w:rPr>
+        <w:t>publication/manuscript/CLAIMS-AND-SOURCES.md</w:t>
+      </w:r>
+      <w:r>
+        <w:rPr>
+          <w:rFonts w:ascii="Times New Roman" w:hAnsi="Times New Roman" w:eastAsia="Times New Roman" w:cs="Times New Roman"/>
+          <w:color w:val="000000"/>
+          <w:sz w:val="24"/>
+        </w:rPr>
+        <w:t xml:space="preserve"> and </w:t>
+      </w:r>
+      <w:r>
+        <w:rPr>
+          <w:rFonts w:ascii="Courier New" w:hAnsi="Courier New" w:eastAsia="Courier New" w:cs="Courier New"/>
+          <w:color w:val="000000"/>
+          <w:sz w:val="22"/>
+        </w:rPr>
+        <w:t>research/results/comparisons/</w:t>
+      </w:r>
+      <w:r>
+        <w:rPr>
+          <w:rFonts w:ascii="Times New Roman" w:hAnsi="Times New Roman" w:eastAsia="Times New Roman" w:cs="Times New Roman"/>
+          <w:color w:val="000000"/>
+          <w:sz w:val="24"/>
+        </w:rPr>
+        <w:t>.</w:t>
       </w:r>
     </w:p>
     <w:p>
@@ -10879,7 +10038,7 @@
           <w:color w:val="000000"/>
           <w:sz w:val="24"/>
         </w:rPr>
-        <w:t xml:space="preserve"> Archived historical supporting table of prospective calibration and</w:t>
+        <w:t xml:space="preserve"> Optional archive: historical Rule A versus Rule P terminal-rule rows.</w:t>
       </w:r>
     </w:p>
     <w:p>
@@ -10892,7 +10051,7 @@
           <w:color w:val="000000"/>
           <w:sz w:val="24"/>
         </w:rPr>
-        <w:t>refinement metrics from final raw rows (not a current C1 or C3 headline). Means</w:t>
+        <w:t>Motivation only; not a current C1 claim.</w:t>
       </w:r>
     </w:p>
     <w:p>
@@ -10902,10 +10061,19 @@
       <w:r>
         <w:rPr>
           <w:rFonts w:ascii="Times New Roman" w:hAnsi="Times New Roman" w:eastAsia="Times New Roman" w:cs="Times New Roman"/>
-          <w:color w:val="000000"/>
-          <w:sz w:val="24"/>
-        </w:rPr>
-        <w:t>use 25 Hill landscape instances with four campaign seeds averaged within each</w:t>
+          <w:b/>
+          <w:color w:val="000000"/>
+          <w:sz w:val="24"/>
+        </w:rPr>
+        <w:t>S2 Table.</w:t>
+      </w:r>
+      <w:r>
+        <w:rPr>
+          <w:rFonts w:ascii="Times New Roman" w:hAnsi="Times New Roman" w:eastAsia="Times New Roman" w:cs="Times New Roman"/>
+          <w:color w:val="000000"/>
+          <w:sz w:val="24"/>
+        </w:rPr>
+        <w:t xml:space="preserve"> Optional archive: historical two-round map-error contrasts.</w:t>
       </w:r>
     </w:p>
     <w:p>
@@ -10918,7 +10086,7 @@
           <w:color w:val="000000"/>
           <w:sz w:val="24"/>
         </w:rPr>
-        <w:t>instance. Calibration uses latent acceptability labels, maps use a 0.50 cutoff,</w:t>
+        <w:t>Motivation only; not a current C3 claim.</w:t>
       </w:r>
     </w:p>
     <w:p>
@@ -10928,10 +10096,19 @@
       <w:r>
         <w:rPr>
           <w:rFonts w:ascii="Times New Roman" w:hAnsi="Times New Roman" w:eastAsia="Times New Roman" w:cs="Times New Roman"/>
-          <w:color w:val="000000"/>
-          <w:sz w:val="24"/>
-        </w:rPr>
-        <w:t>and point recommendations use a common GP. The CSV contains all 12 available</w:t>
+          <w:b/>
+          <w:color w:val="000000"/>
+          <w:sz w:val="24"/>
+        </w:rPr>
+        <w:t>S3 Table.</w:t>
+      </w:r>
+      <w:r>
+        <w:rPr>
+          <w:rFonts w:ascii="Times New Roman" w:hAnsi="Times New Roman" w:eastAsia="Times New Roman" w:cs="Times New Roman"/>
+          <w:color w:val="000000"/>
+          <w:sz w:val="24"/>
+        </w:rPr>
+        <w:t xml:space="preserve"> Optional archive: older posterior self-consistency checks.</w:t>
       </w:r>
     </w:p>
     <w:p>
@@ -10944,207 +10121,7 @@
           <w:color w:val="000000"/>
           <w:sz w:val="24"/>
         </w:rPr>
-        <w:t>target-condition arms, including the 40-well reference.</w:t>
-      </w:r>
-    </w:p>
-    <w:p>
-      <w:pPr>
-        <w:widowControl/>
-      </w:pPr>
-      <w:r>
-        <w:rPr>
-          <w:rFonts w:ascii="Times New Roman" w:hAnsi="Times New Roman" w:eastAsia="Times New Roman" w:cs="Times New Roman"/>
-          <w:b/>
-          <w:color w:val="000000"/>
-          <w:sz w:val="24"/>
-        </w:rPr>
-        <w:t>S2 Table.</w:t>
-      </w:r>
-      <w:r>
-        <w:rPr>
-          <w:rFonts w:ascii="Times New Roman" w:hAnsi="Times New Roman" w:eastAsia="Times New Roman" w:cs="Times New Roman"/>
-          <w:color w:val="000000"/>
-          <w:sz w:val="24"/>
-        </w:rPr>
-        <w:t xml:space="preserve"> Archived historical supporting table: seven-condition comparison for</w:t>
-      </w:r>
-    </w:p>
-    <w:p>
-      <w:pPr>
-        <w:widowControl/>
-      </w:pPr>
-      <w:r>
-        <w:rPr>
-          <w:rFonts w:ascii="Times New Roman" w:hAnsi="Times New Roman" w:eastAsia="Times New Roman" w:cs="Times New Roman"/>
-          <w:color w:val="000000"/>
-          <w:sz w:val="24"/>
-        </w:rPr>
-        <w:t>six matched-budget strategies. Hill estimates use 25 instances with four</w:t>
-      </w:r>
-    </w:p>
-    <w:p>
-      <w:pPr>
-        <w:widowControl/>
-      </w:pPr>
-      <w:r>
-        <w:rPr>
-          <w:rFonts w:ascii="Times New Roman" w:hAnsi="Times New Roman" w:eastAsia="Times New Roman" w:cs="Times New Roman"/>
-          <w:color w:val="000000"/>
-          <w:sz w:val="24"/>
-        </w:rPr>
-        <w:t>campaigns per instance; external-function estimates summarize 100 campaigns on</w:t>
-      </w:r>
-    </w:p>
-    <w:p>
-      <w:pPr>
-        <w:widowControl/>
-      </w:pPr>
-      <w:r>
-        <w:rPr>
-          <w:rFonts w:ascii="Times New Roman" w:hAnsi="Times New Roman" w:eastAsia="Times New Roman" w:cs="Times New Roman"/>
-          <w:color w:val="000000"/>
-          <w:sz w:val="24"/>
-        </w:rPr>
-        <w:t>each specified function. Archived certificate statuses refer to posterior checks,</w:t>
-      </w:r>
-    </w:p>
-    <w:p>
-      <w:pPr>
-        <w:widowControl/>
-      </w:pPr>
-      <w:r>
-        <w:rPr>
-          <w:rFonts w:ascii="Times New Roman" w:hAnsi="Times New Roman" w:eastAsia="Times New Roman" w:cs="Times New Roman"/>
-          <w:color w:val="000000"/>
-          <w:sz w:val="24"/>
-        </w:rPr>
-        <w:t>not empirical validity. All listed arms use 48 wells; lower map error and Rule-P</w:t>
-      </w:r>
-    </w:p>
-    <w:p>
-      <w:pPr>
-        <w:widowControl/>
-      </w:pPr>
-      <w:r>
-        <w:rPr>
-          <w:rFonts w:ascii="Times New Roman" w:hAnsi="Times New Roman" w:eastAsia="Times New Roman" w:cs="Times New Roman"/>
-          <w:color w:val="000000"/>
-          <w:sz w:val="24"/>
-        </w:rPr>
-        <w:t>regret are better. This table is not the C3 matched-round certified-volume</w:t>
-      </w:r>
-    </w:p>
-    <w:p>
-      <w:pPr>
-        <w:widowControl/>
-      </w:pPr>
-      <w:r>
-        <w:rPr>
-          <w:rFonts w:ascii="Times New Roman" w:hAnsi="Times New Roman" w:eastAsia="Times New Roman" w:cs="Times New Roman"/>
-          <w:color w:val="000000"/>
-          <w:sz w:val="24"/>
-        </w:rPr>
-        <w:t>comparison.</w:t>
-      </w:r>
-    </w:p>
-    <w:p>
-      <w:pPr>
-        <w:widowControl/>
-      </w:pPr>
-      <w:r>
-        <w:rPr>
-          <w:rFonts w:ascii="Times New Roman" w:hAnsi="Times New Roman" w:eastAsia="Times New Roman" w:cs="Times New Roman"/>
-          <w:b/>
-          <w:color w:val="000000"/>
-          <w:sz w:val="24"/>
-        </w:rPr>
-        <w:t>S3 Table.</w:t>
-      </w:r>
-      <w:r>
-        <w:rPr>
-          <w:rFonts w:ascii="Times New Roman" w:hAnsi="Times New Roman" w:eastAsia="Times New Roman" w:cs="Times New Roman"/>
-          <w:color w:val="000000"/>
-          <w:sz w:val="24"/>
-        </w:rPr>
-        <w:t xml:space="preserve"> Archived historical supporting table of claim decisions and current</w:t>
-      </w:r>
-    </w:p>
-    <w:p>
-      <w:pPr>
-        <w:widowControl/>
-      </w:pPr>
-      <w:r>
-        <w:rPr>
-          <w:rFonts w:ascii="Times New Roman" w:hAnsi="Times New Roman" w:eastAsia="Times New Roman" w:cs="Times New Roman"/>
-          <w:color w:val="000000"/>
-          <w:sz w:val="24"/>
-        </w:rPr>
-        <w:t>source-reconciled interpretations (kill-ledger). Original statuses, numerical</w:t>
-      </w:r>
-    </w:p>
-    <w:p>
-      <w:pPr>
-        <w:widowControl/>
-      </w:pPr>
-      <w:r>
-        <w:rPr>
-          <w:rFonts w:ascii="Times New Roman" w:hAnsi="Times New Roman" w:eastAsia="Times New Roman" w:cs="Times New Roman"/>
-          <w:color w:val="000000"/>
-          <w:sz w:val="24"/>
-        </w:rPr>
-        <w:t>results, and interpretation text are preserved in separate columns from the</w:t>
-      </w:r>
-    </w:p>
-    <w:p>
-      <w:pPr>
-        <w:widowControl/>
-      </w:pPr>
-      <w:r>
-        <w:rPr>
-          <w:rFonts w:ascii="Times New Roman" w:hAnsi="Times New Roman" w:eastAsia="Times New Roman" w:cs="Times New Roman"/>
-          <w:color w:val="000000"/>
-          <w:sz w:val="24"/>
-        </w:rPr>
-        <w:t>corrected interpretation. Certificate checks do not establish empirical</w:t>
-      </w:r>
-    </w:p>
-    <w:p>
-      <w:pPr>
-        <w:widowControl/>
-      </w:pPr>
-      <w:r>
-        <w:rPr>
-          <w:rFonts w:ascii="Times New Roman" w:hAnsi="Times New Roman" w:eastAsia="Times New Roman" w:cs="Times New Roman"/>
-          <w:color w:val="000000"/>
-          <w:sz w:val="24"/>
-        </w:rPr>
-        <w:t>validity; the Plate-2 gain is below the practical threshold, and the qLogNEI map</w:t>
-      </w:r>
-    </w:p>
-    <w:p>
-      <w:pPr>
-        <w:widowControl/>
-      </w:pPr>
-      <w:r>
-        <w:rPr>
-          <w:rFonts w:ascii="Times New Roman" w:hAnsi="Times New Roman" w:eastAsia="Times New Roman" w:cs="Times New Roman"/>
-          <w:color w:val="000000"/>
-          <w:sz w:val="24"/>
-        </w:rPr>
-        <w:t>contrast exceeds that threshold. Denominators retain their original units and</w:t>
-      </w:r>
-    </w:p>
-    <w:p>
-      <w:pPr>
-        <w:widowControl/>
-      </w:pPr>
-      <w:r>
-        <w:rPr>
-          <w:rFonts w:ascii="Times New Roman" w:hAnsi="Times New Roman" w:eastAsia="Times New Roman" w:cs="Times New Roman"/>
-          <w:color w:val="000000"/>
-          <w:sz w:val="24"/>
-        </w:rPr>
-        <w:t>are not uniformly independent campaigns.</w:t>
+        <w:t>These do not replace empirical containment or the C3 certified-volume result.</w:t>
       </w:r>
     </w:p>
     <w:sectPr>

</xml_diff>

<commit_message>
docs: sync PLOS and publication Word packages to Mock A figures
Align Fig 2 caption with the certified-volume contrast panel, drop a stale
orphan caption, and rebuild both submission Word files from the updated Markdown.
</commit_message>
<xml_diff>
--- a/manuscript/SPADE-PLOS-ONE.docx
+++ b/manuscript/SPADE-PLOS-ONE.docx
@@ -4160,7 +4160,7 @@
           <w:color w:val="000000"/>
           <w:sz w:val="20"/>
         </w:rPr>
-        <w:t>Fig 2. SPADE’s primary advantage: trusted operating regions. (A) Mean certified volume at matched five rounds (leave-one-family-out): SPADE versus qLogNEI; locked contrast +0.000855 (95% CI [+0.000691, +0.001028], p&lt;0.0001, n=320). (B) Observed truth containment among answered regions at prevalence 0.30: SPADE 66/66 versus screened DoE 85/122 and unscreened DoE 77/134.</w:t>
+        <w:t>Fig 2. SPADE’s primary advantage: trusted operating regions. (A) Certified-volume difference (SPADE minus qLogNEI) at matched five rounds under leave-one-family-out calibration: +0.000855 (95% CI [+0.000691, +0.001028], p&lt;0.0001, n=320); absolute means are noted under the panel. (B) Observed truth containment among answered regions at prevalence 0.30: SPADE 66/66 versus screened DoE 85/122 and unscreened DoE 77/134.</w:t>
       </w:r>
     </w:p>
     <w:p>
@@ -4844,19 +4844,6 @@
           <w:sz w:val="20"/>
         </w:rPr>
         <w:t>Fig 3. Point-recipe trade-off (secondary to the region decision). (A) SPADE at five rounds minus qLogNEI at ten rounds on simple regret: no detectable difference (−0.0005, 95% CI [−0.0221, +0.0207], n=160); not claimed as equivalence. (B) SPADE at five rounds minus screened DoE at three rounds: DoE finds the better single recipe (+0.1026, 95% CI [+0.0486, +0.1578]); expected when the goal is one point rather than a region.</w:t>
-      </w:r>
-    </w:p>
-    <w:p>
-      <w:pPr>
-        <w:widowControl/>
-      </w:pPr>
-      <w:r>
-        <w:rPr>
-          <w:rFonts w:ascii="Times New Roman" w:hAnsi="Times New Roman" w:eastAsia="Times New Roman" w:cs="Times New Roman"/>
-          <w:color w:val="000000"/>
-          <w:sz w:val="24"/>
-        </w:rPr>
-        <w:t>Fig 2. Point-recipe contrasts from the one-process DC comparison. (A) SPADE at five rounds minus qLogNEI at ten rounds on simple regret (n=160); shaded band is ±0.02. The estimate shows no detectable difference and does not establish equivalence. (B) SPADE at five rounds minus screened DoE at three rounds; DoE finds the better point recipe.</w:t>
       </w:r>
     </w:p>
     <w:p>

</xml_diff>

<commit_message>
docs: rebuild Fig 1 as a study-design schematic
Replace the decision-board Fig 1 with a PLOS-style schematic: fixed 48-well
campaign, point versus region end decisions, and the methods compared in this
benchmark.
</commit_message>
<xml_diff>
--- a/manuscript/SPADE-PLOS-ONE.docx
+++ b/manuscript/SPADE-PLOS-ONE.docx
@@ -654,7 +654,7 @@
       <w:r>
         <w:drawing>
           <wp:inline xmlns:a="http://schemas.openxmlformats.org/drawingml/2006/main" xmlns:pic="http://schemas.openxmlformats.org/drawingml/2006/picture">
-            <wp:extent cx="5897880" cy="2228025"/>
+            <wp:extent cx="5897880" cy="2187833"/>
             <wp:docPr id="1" name="Picture 1"/>
             <wp:cNvGraphicFramePr>
               <a:graphicFrameLocks noChangeAspect="1"/>
@@ -675,7 +675,7 @@
                   <pic:spPr>
                     <a:xfrm>
                       <a:off x="0" y="0"/>
-                      <a:ext cx="5897880" cy="2228025"/>
+                      <a:ext cx="5897880" cy="2187833"/>
                     </a:xfrm>
                     <a:prstGeom prst="rect"/>
                   </pic:spPr>
@@ -698,7 +698,7 @@
           <w:color w:val="000000"/>
           <w:sz w:val="20"/>
         </w:rPr>
-        <w:t>Fig 1. Method selection under a fixed 48-well budget.</w:t>
+        <w:t>Fig 1. Study design under a fixed 48-well budget. (A) Every compared arm uses the same 48-well campaign total; the method chooses round structure and the terminal return. (B) The same wells can be scored as a point-recipe decision (simple regret) or as an operating-region decision (certified volume, truth containment, or abstention). (C) SPADE is evaluated as the region-first architecture; qLogNEI is the noisy Bayesian-optimization comparator; DoE pipelines are classical response-surface designs that often win the single-recipe job. This schematic defines the benchmark and contains no performance result.</w:t>
       </w:r>
       <w:r>
         <w:rPr>

</xml_diff>

<commit_message>
fix: rebuild Fig 1 layout without overlapping text
Use three separate axes with reserved gaps between decision cards and
method rows so labels no longer collide; align SPADE’s color with the
operating-region decision.
</commit_message>
<xml_diff>
--- a/manuscript/SPADE-PLOS-ONE.docx
+++ b/manuscript/SPADE-PLOS-ONE.docx
@@ -654,7 +654,7 @@
       <w:r>
         <w:drawing>
           <wp:inline xmlns:a="http://schemas.openxmlformats.org/drawingml/2006/main" xmlns:pic="http://schemas.openxmlformats.org/drawingml/2006/picture">
-            <wp:extent cx="5897880" cy="2187833"/>
+            <wp:extent cx="5897880" cy="2335717"/>
             <wp:docPr id="1" name="Picture 1"/>
             <wp:cNvGraphicFramePr>
               <a:graphicFrameLocks noChangeAspect="1"/>
@@ -675,7 +675,7 @@
                   <pic:spPr>
                     <a:xfrm>
                       <a:off x="0" y="0"/>
-                      <a:ext cx="5897880" cy="2187833"/>
+                      <a:ext cx="5897880" cy="2335717"/>
                     </a:xfrm>
                     <a:prstGeom prst="rect"/>
                   </pic:spPr>

</xml_diff>

<commit_message>
fix: conventional top-down Fig 1 flowchart with clear title gap
Replace side cards with a standard campaign → decisions → methods
flowchart; put panel letters beside each tier so they no longer crowd
the figure title.
</commit_message>
<xml_diff>
--- a/manuscript/SPADE-PLOS-ONE.docx
+++ b/manuscript/SPADE-PLOS-ONE.docx
@@ -654,7 +654,7 @@
       <w:r>
         <w:drawing>
           <wp:inline xmlns:a="http://schemas.openxmlformats.org/drawingml/2006/main" xmlns:pic="http://schemas.openxmlformats.org/drawingml/2006/picture">
-            <wp:extent cx="5897880" cy="2335717"/>
+            <wp:extent cx="5897880" cy="3487863"/>
             <wp:docPr id="1" name="Picture 1"/>
             <wp:cNvGraphicFramePr>
               <a:graphicFrameLocks noChangeAspect="1"/>
@@ -675,7 +675,7 @@
                   <pic:spPr>
                     <a:xfrm>
                       <a:off x="0" y="0"/>
-                      <a:ext cx="5897880" cy="2335717"/>
+                      <a:ext cx="5897880" cy="3487863"/>
                     </a:xfrm>
                     <a:prstGeom prst="rect"/>
                   </pic:spPr>
@@ -698,7 +698,7 @@
           <w:color w:val="000000"/>
           <w:sz w:val="20"/>
         </w:rPr>
-        <w:t>Fig 1. Study design under a fixed 48-well budget. (A) Every compared arm uses the same 48-well campaign total; the method chooses round structure and the terminal return. (B) The same wells can be scored as a point-recipe decision (simple regret) or as an operating-region decision (certified volume, truth containment, or abstention). (C) SPADE is evaluated as the region-first architecture; qLogNEI is the noisy Bayesian-optimization comparator; DoE pipelines are classical response-surface designs that often win the single-recipe job. This schematic defines the benchmark and contains no performance result.</w:t>
+        <w:t>Fig 1. Study design under a fixed 48-well budget. (A) Every arm uses the same 48-well campaign; the method chooses round structure and the terminal return. (B) The campaign is scored as a point-recipe decision (simple regret) and/or an operating-region decision (certified volume, containment, or abstention). (C) Comparators in this study: SPADE (region-first), qLogNEI (noisy Bayesian optimization), and DoE response-surface pipelines. This schematic defines the benchmark and contains no performance result.</w:t>
       </w:r>
       <w:r>
         <w:rPr>

</xml_diff>

<commit_message>
style: restyle Fig 1 as black-and-white line art
Use square boxes, minimal gray fill, and thin black arrows so the study
schematic matches conventional methods-paper figures rather than UI cards.
</commit_message>
<xml_diff>
--- a/manuscript/SPADE-PLOS-ONE.docx
+++ b/manuscript/SPADE-PLOS-ONE.docx
@@ -654,7 +654,7 @@
       <w:r>
         <w:drawing>
           <wp:inline xmlns:a="http://schemas.openxmlformats.org/drawingml/2006/main" xmlns:pic="http://schemas.openxmlformats.org/drawingml/2006/picture">
-            <wp:extent cx="5897880" cy="3487863"/>
+            <wp:extent cx="5897880" cy="3327920"/>
             <wp:docPr id="1" name="Picture 1"/>
             <wp:cNvGraphicFramePr>
               <a:graphicFrameLocks noChangeAspect="1"/>
@@ -675,7 +675,7 @@
                   <pic:spPr>
                     <a:xfrm>
                       <a:off x="0" y="0"/>
-                      <a:ext cx="5897880" cy="3487863"/>
+                      <a:ext cx="5897880" cy="3327920"/>
                     </a:xfrm>
                     <a:prstGeom prst="rect"/>
                   </pic:spPr>

</xml_diff>